<commit_message>
Doku: 2FA-Pflicht beim Publizieren auf npmjs.com dokumentiert
Co-Authored-By: Claude Fable 5.1 <noreply@anthropic.com>
Claude-Session: https://claude.ai/code/session_01LrLPuYCXBtmrXtoqs5tDFr
</commit_message>
<xml_diff>
--- a/doku/M324_React_Package_Johnny_Leonhardt.docx
+++ b/doku/M324_React_Package_Johnny_Leonhardt.docx
@@ -3678,6 +3678,18 @@
     </w:p>
     <w:p>
       <w:pPr>
+        <w:spacing w:after="120"/>
+      </w:pPr>
+      <w:r>
+        <w:rPr>
+          <w:b w:val="0"/>
+          <w:i w:val="0"/>
+        </w:rPr>
+        <w:t>Der erste Versuch scheiterte mit 403: npmjs.com verlangt seit 2025 für jedes Publizieren eine Zwei-Faktor-Authentifizierung, Tokens mit "Bypass 2FA" (wie in der Modul-Anleitung beschrieben) werden eingeschränkt. Nach dem Aktivieren von 2FA mit einem Passkey öffnet npm publish einen Browser-Link, dort bestätigt man mit dem Passkey, und das Terminal fährt fort. Wichtig: Das funktioniert nur in einem interaktiven Terminal, nicht in einem Skript.</w:t>
+      </w:r>
+    </w:p>
+    <w:p>
+      <w:pPr>
         <w:spacing w:after="0" w:before="0" w:line="240" w:lineRule="auto"/>
         <w:ind w:left="283"/>
         <w:shd w:val="clear" w:color="auto" w:fill="F2F2F2"/>
@@ -3687,7 +3699,7 @@
           <w:rFonts w:ascii="Consolas" w:hAnsi="Consolas"/>
           <w:sz w:val="18"/>
         </w:rPr>
-        <w:t>npm login</w:t>
+        <w:t>PS C:\CodeÔ\mybargraph&gt; npm login</w:t>
       </w:r>
     </w:p>
     <w:p>
@@ -3701,12 +3713,12 @@
           <w:rFonts w:ascii="Consolas" w:hAnsi="Consolas"/>
           <w:sz w:val="18"/>
         </w:rPr>
-        <w:t>npm whoami                     # johnsoryna</w:t>
+        <w:t>Logged in on https://registry.npmjs.org/.</w:t>
       </w:r>
     </w:p>
     <w:p>
       <w:pPr>
-        <w:spacing w:after="160" w:before="0" w:line="240" w:lineRule="auto"/>
+        <w:spacing w:after="0" w:before="0" w:line="240" w:lineRule="auto"/>
         <w:ind w:left="283"/>
         <w:shd w:val="clear" w:color="auto" w:fill="F2F2F2"/>
       </w:pPr>
@@ -3715,7 +3727,133 @@
           <w:rFonts w:ascii="Consolas" w:hAnsi="Consolas"/>
           <w:sz w:val="18"/>
         </w:rPr>
-        <w:t>npm publish --access public</w:t>
+        <w:t xml:space="preserve"> </w:t>
+      </w:r>
+    </w:p>
+    <w:p>
+      <w:pPr>
+        <w:spacing w:after="0" w:before="0" w:line="240" w:lineRule="auto"/>
+        <w:ind w:left="283"/>
+        <w:shd w:val="clear" w:color="auto" w:fill="F2F2F2"/>
+      </w:pPr>
+      <w:r>
+        <w:rPr>
+          <w:rFonts w:ascii="Consolas" w:hAnsi="Consolas"/>
+          <w:sz w:val="18"/>
+        </w:rPr>
+        <w:t>PS C:\CodeÔ\mybargraph&gt; npm publish --access public</w:t>
+      </w:r>
+    </w:p>
+    <w:p>
+      <w:pPr>
+        <w:spacing w:after="0" w:before="0" w:line="240" w:lineRule="auto"/>
+        <w:ind w:left="283"/>
+        <w:shd w:val="clear" w:color="auto" w:fill="F2F2F2"/>
+      </w:pPr>
+      <w:r>
+        <w:rPr>
+          <w:rFonts w:ascii="Consolas" w:hAnsi="Consolas"/>
+          <w:sz w:val="18"/>
+        </w:rPr>
+        <w:t>npm notice package: @johnsoryna/mybargraph@1.0.0</w:t>
+      </w:r>
+    </w:p>
+    <w:p>
+      <w:pPr>
+        <w:spacing w:after="0" w:before="0" w:line="240" w:lineRule="auto"/>
+        <w:ind w:left="283"/>
+        <w:shd w:val="clear" w:color="auto" w:fill="F2F2F2"/>
+      </w:pPr>
+      <w:r>
+        <w:rPr>
+          <w:rFonts w:ascii="Consolas" w:hAnsi="Consolas"/>
+          <w:sz w:val="18"/>
+        </w:rPr>
+        <w:t>npm notice total files: 5</w:t>
+      </w:r>
+    </w:p>
+    <w:p>
+      <w:pPr>
+        <w:spacing w:after="0" w:before="0" w:line="240" w:lineRule="auto"/>
+        <w:ind w:left="283"/>
+        <w:shd w:val="clear" w:color="auto" w:fill="F2F2F2"/>
+      </w:pPr>
+      <w:r>
+        <w:rPr>
+          <w:rFonts w:ascii="Consolas" w:hAnsi="Consolas"/>
+          <w:sz w:val="18"/>
+        </w:rPr>
+        <w:t>npm notice Publishing to https://registry.npmjs.org/ with tag latest and public access</w:t>
+      </w:r>
+    </w:p>
+    <w:p>
+      <w:pPr>
+        <w:spacing w:after="0" w:before="0" w:line="240" w:lineRule="auto"/>
+        <w:ind w:left="283"/>
+        <w:shd w:val="clear" w:color="auto" w:fill="F2F2F2"/>
+      </w:pPr>
+      <w:r>
+        <w:rPr>
+          <w:rFonts w:ascii="Consolas" w:hAnsi="Consolas"/>
+          <w:sz w:val="18"/>
+        </w:rPr>
+        <w:t>Authenticate your account at:</w:t>
+      </w:r>
+    </w:p>
+    <w:p>
+      <w:pPr>
+        <w:spacing w:after="0" w:before="0" w:line="240" w:lineRule="auto"/>
+        <w:ind w:left="283"/>
+        <w:shd w:val="clear" w:color="auto" w:fill="F2F2F2"/>
+      </w:pPr>
+      <w:r>
+        <w:rPr>
+          <w:rFonts w:ascii="Consolas" w:hAnsi="Consolas"/>
+          <w:sz w:val="18"/>
+        </w:rPr>
+        <w:t>https://www.npmjs.com/auth/cli/984ba77b-....</w:t>
+      </w:r>
+    </w:p>
+    <w:p>
+      <w:pPr>
+        <w:spacing w:after="0" w:before="0" w:line="240" w:lineRule="auto"/>
+        <w:ind w:left="283"/>
+        <w:shd w:val="clear" w:color="auto" w:fill="F2F2F2"/>
+      </w:pPr>
+      <w:r>
+        <w:rPr>
+          <w:rFonts w:ascii="Consolas" w:hAnsi="Consolas"/>
+          <w:sz w:val="18"/>
+        </w:rPr>
+        <w:t>Press ENTER to open in the browser...</w:t>
+      </w:r>
+    </w:p>
+    <w:p>
+      <w:pPr>
+        <w:spacing w:after="0" w:before="0" w:line="240" w:lineRule="auto"/>
+        <w:ind w:left="283"/>
+        <w:shd w:val="clear" w:color="auto" w:fill="F2F2F2"/>
+      </w:pPr>
+      <w:r>
+        <w:rPr>
+          <w:rFonts w:ascii="Consolas" w:hAnsi="Consolas"/>
+          <w:sz w:val="18"/>
+        </w:rPr>
+        <w:t xml:space="preserve"> </w:t>
+      </w:r>
+    </w:p>
+    <w:p>
+      <w:pPr>
+        <w:spacing w:after="160" w:before="0" w:line="240" w:lineRule="auto"/>
+        <w:ind w:left="283"/>
+        <w:shd w:val="clear" w:color="auto" w:fill="F2F2F2"/>
+      </w:pPr>
+      <w:r>
+        <w:rPr>
+          <w:rFonts w:ascii="Consolas" w:hAnsi="Consolas"/>
+          <w:sz w:val="18"/>
+        </w:rPr>
+        <w:t>+ @johnsoryna/mybargraph@1.0.0</w:t>
       </w:r>
     </w:p>
     <w:p>
@@ -4390,6 +4528,15 @@
       </w:pPr>
       <w:r>
         <w:t>Der Unterschied zu Maven: Bei npm ist der Konsument-Registry-Zugriff ohne Konfiguration möglich, bei GitHub Packages braucht auch npm (wie Maven) ein Token zum Lesen.</w:t>
+      </w:r>
+    </w:p>
+    <w:p>
+      <w:pPr>
+        <w:pStyle w:val="ListBullet"/>
+        <w:spacing w:after="40"/>
+      </w:pPr>
+      <w:r>
+        <w:t>npmjs.com erzwingt 2FA beim Publizieren. Der Access-Token-Weg mit "Bypass 2FA" aus der Anleitung wird eingeschränkt, für Pipelines ist Trusted Publishing (OIDC) der vorgesehene Ersatz.</w:t>
       </w:r>
     </w:p>
     <w:p>

</xml_diff>

<commit_message>
Doku: Screenshots (Demo, Konsument, Build, Explorer, npmjs, GitHub) eingebettet
Co-Authored-By: Claude Fable 5.1 <noreply@anthropic.com>
Claude-Session: https://claude.ai/code/session_01LrLPuYCXBtmrXtoqs5tDFr
</commit_message>
<xml_diff>
--- a/doku/M324_React_Package_Johnny_Leonhardt.docx
+++ b/doku/M324_React_Package_Johnny_Leonhardt.docx
@@ -1625,15 +1625,41 @@
     </w:p>
     <w:p>
       <w:pPr>
-        <w:spacing w:before="200" w:after="40"/>
         <w:jc w:val="center"/>
       </w:pPr>
       <w:r>
-        <w:rPr>
-          <w:b/>
-          <w:highlight w:val="yellow"/>
-        </w:rPr>
-        <w:t>[Screenshot einfuegen: screenshots/intellij_projekt.png]</w:t>
+        <w:drawing>
+          <wp:inline xmlns:a="http://schemas.openxmlformats.org/drawingml/2006/main" xmlns:pic="http://schemas.openxmlformats.org/drawingml/2006/picture">
+            <wp:extent cx="5580000" cy="3138750"/>
+            <wp:docPr id="1" name="Picture 1"/>
+            <wp:cNvGraphicFramePr>
+              <a:graphicFrameLocks noChangeAspect="1"/>
+            </wp:cNvGraphicFramePr>
+            <a:graphic>
+              <a:graphicData uri="http://schemas.openxmlformats.org/drawingml/2006/picture">
+                <pic:pic>
+                  <pic:nvPicPr>
+                    <pic:cNvPr id="0" name="projekt_explorer.png"/>
+                    <pic:cNvPicPr/>
+                  </pic:nvPicPr>
+                  <pic:blipFill>
+                    <a:blip r:embed="rId9"/>
+                    <a:stretch>
+                      <a:fillRect/>
+                    </a:stretch>
+                  </pic:blipFill>
+                  <pic:spPr>
+                    <a:xfrm>
+                      <a:off x="0" y="0"/>
+                      <a:ext cx="5580000" cy="3138750"/>
+                    </a:xfrm>
+                    <a:prstGeom prst="rect"/>
+                  </pic:spPr>
+                </pic:pic>
+              </a:graphicData>
+            </a:graphic>
+          </wp:inline>
+        </w:drawing>
       </w:r>
     </w:p>
     <w:p>
@@ -1646,7 +1672,7 @@
           <w:i/>
           <w:sz w:val="18"/>
         </w:rPr>
-        <w:t>Projektstruktur des Packages in IntelliJ</w:t>
+        <w:t>Projektstruktur des Packages: src, demo, dist, doku und die beiden Vite-Konfigurationen</w:t>
       </w:r>
     </w:p>
     <w:p>
@@ -3323,15 +3349,41 @@
     </w:p>
     <w:p>
       <w:pPr>
-        <w:spacing w:before="200" w:after="40"/>
         <w:jc w:val="center"/>
       </w:pPr>
       <w:r>
-        <w:rPr>
-          <w:b/>
-          <w:highlight w:val="yellow"/>
-        </w:rPr>
-        <w:t>[Screenshot einfuegen: screenshots/term_build.png]</w:t>
+        <w:drawing>
+          <wp:inline xmlns:a="http://schemas.openxmlformats.org/drawingml/2006/main" xmlns:pic="http://schemas.openxmlformats.org/drawingml/2006/picture">
+            <wp:extent cx="5580000" cy="2981096"/>
+            <wp:docPr id="2" name="Picture 2"/>
+            <wp:cNvGraphicFramePr>
+              <a:graphicFrameLocks noChangeAspect="1"/>
+            </wp:cNvGraphicFramePr>
+            <a:graphic>
+              <a:graphicData uri="http://schemas.openxmlformats.org/drawingml/2006/picture">
+                <pic:pic>
+                  <pic:nvPicPr>
+                    <pic:cNvPr id="0" name="term_build.png"/>
+                    <pic:cNvPicPr/>
+                  </pic:nvPicPr>
+                  <pic:blipFill>
+                    <a:blip r:embed="rId10"/>
+                    <a:stretch>
+                      <a:fillRect/>
+                    </a:stretch>
+                  </pic:blipFill>
+                  <pic:spPr>
+                    <a:xfrm>
+                      <a:off x="0" y="0"/>
+                      <a:ext cx="5580000" cy="2981096"/>
+                    </a:xfrm>
+                    <a:prstGeom prst="rect"/>
+                  </pic:spPr>
+                </pic:pic>
+              </a:graphicData>
+            </a:graphic>
+          </wp:inline>
+        </w:drawing>
       </w:r>
     </w:p>
     <w:p>
@@ -3445,7 +3497,7 @@
         <w:drawing>
           <wp:inline xmlns:a="http://schemas.openxmlformats.org/drawingml/2006/main" xmlns:pic="http://schemas.openxmlformats.org/drawingml/2006/picture">
             <wp:extent cx="5580000" cy="2711709"/>
-            <wp:docPr id="1" name="Picture 1"/>
+            <wp:docPr id="3" name="Picture 3"/>
             <wp:cNvGraphicFramePr>
               <a:graphicFrameLocks noChangeAspect="1"/>
             </wp:cNvGraphicFramePr>
@@ -3457,7 +3509,7 @@
                     <pic:cNvPicPr/>
                   </pic:nvPicPr>
                   <pic:blipFill>
-                    <a:blip r:embed="rId9"/>
+                    <a:blip r:embed="rId11"/>
                     <a:stretch>
                       <a:fillRect/>
                     </a:stretch>
@@ -3858,401 +3910,13 @@
     </w:p>
     <w:p>
       <w:pPr>
-        <w:spacing w:before="200" w:after="40"/>
-        <w:jc w:val="center"/>
-      </w:pPr>
-      <w:r>
-        <w:rPr>
-          <w:b/>
-          <w:highlight w:val="yellow"/>
-        </w:rPr>
-        <w:t>[Screenshot einfuegen: screenshots/term_publish.png]</w:t>
-      </w:r>
-    </w:p>
-    <w:p>
-      <w:pPr>
-        <w:spacing w:after="240"/>
-        <w:jc w:val="center"/>
-      </w:pPr>
-      <w:r>
-        <w:rPr>
-          <w:i/>
-          <w:sz w:val="18"/>
-        </w:rPr>
-        <w:t>npm publish --access public im Terminal</w:t>
-      </w:r>
-    </w:p>
-    <w:p>
-      <w:pPr>
-        <w:spacing w:before="200" w:after="40"/>
-        <w:jc w:val="center"/>
-      </w:pPr>
-      <w:r>
-        <w:rPr>
-          <w:b/>
-          <w:highlight w:val="yellow"/>
-        </w:rPr>
-        <w:t>[Screenshot einfuegen: screenshots/npmjs_package.png]</w:t>
-      </w:r>
-    </w:p>
-    <w:p>
-      <w:pPr>
-        <w:spacing w:after="240"/>
-        <w:jc w:val="center"/>
-      </w:pPr>
-      <w:r>
-        <w:rPr>
-          <w:i/>
-          <w:sz w:val="18"/>
-        </w:rPr>
-        <w:t>Das Package @johnsoryna/mybargraph auf npmjs.com</w:t>
-      </w:r>
-    </w:p>
-    <w:p>
-      <w:pPr>
-        <w:spacing w:after="120"/>
-      </w:pPr>
-      <w:r>
-        <w:rPr>
-          <w:b w:val="0"/>
-          <w:i w:val="0"/>
-        </w:rPr>
-        <w:t>Eine publizierte Version ist unveränderlich. Für jede weitere Publikation muss die Version erhöht werden, z.B. mit npm version patch (1.0.0 -&gt; 1.0.1), erst dann geht npm publish wieder durch.</w:t>
-      </w:r>
-    </w:p>
-    <w:p>
-      <w:pPr>
-        <w:pStyle w:val="Heading1"/>
-      </w:pPr>
-      <w:r>
-        <w:t>Aufgabe: Package im eigenen Projekt verwenden</w:t>
-      </w:r>
-    </w:p>
-    <w:p>
-      <w:pPr>
-        <w:spacing w:after="120"/>
-      </w:pPr>
-      <w:r>
-        <w:rPr>
-          <w:b w:val="0"/>
-          <w:i w:val="0"/>
-        </w:rPr>
-        <w:t>Zweites Projekt bargraph-consumer, ebenfalls mit Vite und React. Das Package wird wie jede andere Abhängigkeit installiert und landet unter node_modules/@johnsoryna/mybargraph, nur mit dist/, README und package.json, ohne Quellcode.</w:t>
-      </w:r>
-    </w:p>
-    <w:p>
-      <w:pPr>
-        <w:spacing w:after="0" w:before="0" w:line="240" w:lineRule="auto"/>
-        <w:ind w:left="283"/>
-        <w:shd w:val="clear" w:color="auto" w:fill="F2F2F2"/>
-      </w:pPr>
-      <w:r>
-        <w:rPr>
-          <w:rFonts w:ascii="Consolas" w:hAnsi="Consolas"/>
-          <w:sz w:val="18"/>
-        </w:rPr>
-        <w:t>npm create vite@latest bargraph-consumer -- --template react</w:t>
-      </w:r>
-    </w:p>
-    <w:p>
-      <w:pPr>
-        <w:spacing w:after="0" w:before="0" w:line="240" w:lineRule="auto"/>
-        <w:ind w:left="283"/>
-        <w:shd w:val="clear" w:color="auto" w:fill="F2F2F2"/>
-      </w:pPr>
-      <w:r>
-        <w:rPr>
-          <w:rFonts w:ascii="Consolas" w:hAnsi="Consolas"/>
-          <w:sz w:val="18"/>
-        </w:rPr>
-        <w:t>cd bargraph-consumer</w:t>
-      </w:r>
-    </w:p>
-    <w:p>
-      <w:pPr>
-        <w:spacing w:after="0" w:before="0" w:line="240" w:lineRule="auto"/>
-        <w:ind w:left="283"/>
-        <w:shd w:val="clear" w:color="auto" w:fill="F2F2F2"/>
-      </w:pPr>
-      <w:r>
-        <w:rPr>
-          <w:rFonts w:ascii="Consolas" w:hAnsi="Consolas"/>
-          <w:sz w:val="18"/>
-        </w:rPr>
-        <w:t>npm install</w:t>
-      </w:r>
-    </w:p>
-    <w:p>
-      <w:pPr>
-        <w:spacing w:after="160" w:before="0" w:line="240" w:lineRule="auto"/>
-        <w:ind w:left="283"/>
-        <w:shd w:val="clear" w:color="auto" w:fill="F2F2F2"/>
-      </w:pPr>
-      <w:r>
-        <w:rPr>
-          <w:rFonts w:ascii="Consolas" w:hAnsi="Consolas"/>
-          <w:sz w:val="18"/>
-        </w:rPr>
-        <w:t>npm install @johnsoryna/mybargraph</w:t>
-      </w:r>
-    </w:p>
-    <w:p>
-      <w:pPr>
-        <w:spacing w:after="0" w:before="0" w:line="240" w:lineRule="auto"/>
-        <w:ind w:left="283"/>
-        <w:shd w:val="clear" w:color="auto" w:fill="F2F2F2"/>
-      </w:pPr>
-      <w:r>
-        <w:rPr>
-          <w:rFonts w:ascii="Consolas" w:hAnsi="Consolas"/>
-          <w:sz w:val="18"/>
-        </w:rPr>
-        <w:t>// src/App.jsx (gekuerzt)</w:t>
-      </w:r>
-    </w:p>
-    <w:p>
-      <w:pPr>
-        <w:spacing w:after="0" w:before="0" w:line="240" w:lineRule="auto"/>
-        <w:ind w:left="283"/>
-        <w:shd w:val="clear" w:color="auto" w:fill="F2F2F2"/>
-      </w:pPr>
-      <w:r>
-        <w:rPr>
-          <w:rFonts w:ascii="Consolas" w:hAnsi="Consolas"/>
-          <w:sz w:val="18"/>
-        </w:rPr>
-        <w:t>import { useState } from 'react'</w:t>
-      </w:r>
-    </w:p>
-    <w:p>
-      <w:pPr>
-        <w:spacing w:after="0" w:before="0" w:line="240" w:lineRule="auto"/>
-        <w:ind w:left="283"/>
-        <w:shd w:val="clear" w:color="auto" w:fill="F2F2F2"/>
-      </w:pPr>
-      <w:r>
-        <w:rPr>
-          <w:rFonts w:ascii="Consolas" w:hAnsi="Consolas"/>
-          <w:sz w:val="18"/>
-        </w:rPr>
-        <w:t>import HorizontalBarGraph from '@johnsoryna/mybargraph'</w:t>
-      </w:r>
-    </w:p>
-    <w:p>
-      <w:pPr>
-        <w:spacing w:after="0" w:before="0" w:line="240" w:lineRule="auto"/>
-        <w:ind w:left="283"/>
-        <w:shd w:val="clear" w:color="auto" w:fill="F2F2F2"/>
-      </w:pPr>
-      <w:r>
-        <w:rPr>
-          <w:rFonts w:ascii="Consolas" w:hAnsi="Consolas"/>
-          <w:sz w:val="18"/>
-        </w:rPr>
-        <w:t xml:space="preserve"> </w:t>
-      </w:r>
-    </w:p>
-    <w:p>
-      <w:pPr>
-        <w:spacing w:after="0" w:before="0" w:line="240" w:lineRule="auto"/>
-        <w:ind w:left="283"/>
-        <w:shd w:val="clear" w:color="auto" w:fill="F2F2F2"/>
-      </w:pPr>
-      <w:r>
-        <w:rPr>
-          <w:rFonts w:ascii="Consolas" w:hAnsi="Consolas"/>
-          <w:sz w:val="18"/>
-        </w:rPr>
-        <w:t>function App() {</w:t>
-      </w:r>
-    </w:p>
-    <w:p>
-      <w:pPr>
-        <w:spacing w:after="0" w:before="0" w:line="240" w:lineRule="auto"/>
-        <w:ind w:left="283"/>
-        <w:shd w:val="clear" w:color="auto" w:fill="F2F2F2"/>
-      </w:pPr>
-      <w:r>
-        <w:rPr>
-          <w:rFonts w:ascii="Consolas" w:hAnsi="Consolas"/>
-          <w:sz w:val="18"/>
-        </w:rPr>
-        <w:t xml:space="preserve">  const [value, setValue] = useState(42)</w:t>
-      </w:r>
-    </w:p>
-    <w:p>
-      <w:pPr>
-        <w:spacing w:after="0" w:before="0" w:line="240" w:lineRule="auto"/>
-        <w:ind w:left="283"/>
-        <w:shd w:val="clear" w:color="auto" w:fill="F2F2F2"/>
-      </w:pPr>
-      <w:r>
-        <w:rPr>
-          <w:rFonts w:ascii="Consolas" w:hAnsi="Consolas"/>
-          <w:sz w:val="18"/>
-        </w:rPr>
-        <w:t xml:space="preserve">  return (</w:t>
-      </w:r>
-    </w:p>
-    <w:p>
-      <w:pPr>
-        <w:spacing w:after="0" w:before="0" w:line="240" w:lineRule="auto"/>
-        <w:ind w:left="283"/>
-        <w:shd w:val="clear" w:color="auto" w:fill="F2F2F2"/>
-      </w:pPr>
-      <w:r>
-        <w:rPr>
-          <w:rFonts w:ascii="Consolas" w:hAnsi="Consolas"/>
-          <w:sz w:val="18"/>
-        </w:rPr>
-        <w:t xml:space="preserve">    &lt;&gt;</w:t>
-      </w:r>
-    </w:p>
-    <w:p>
-      <w:pPr>
-        <w:spacing w:after="0" w:before="0" w:line="240" w:lineRule="auto"/>
-        <w:ind w:left="283"/>
-        <w:shd w:val="clear" w:color="auto" w:fill="F2F2F2"/>
-      </w:pPr>
-      <w:r>
-        <w:rPr>
-          <w:rFonts w:ascii="Consolas" w:hAnsi="Consolas"/>
-          <w:sz w:val="18"/>
-        </w:rPr>
-        <w:t xml:space="preserve">      &lt;input type="range" min="0" max="100" value={value}</w:t>
-      </w:r>
-    </w:p>
-    <w:p>
-      <w:pPr>
-        <w:spacing w:after="0" w:before="0" w:line="240" w:lineRule="auto"/>
-        <w:ind w:left="283"/>
-        <w:shd w:val="clear" w:color="auto" w:fill="F2F2F2"/>
-      </w:pPr>
-      <w:r>
-        <w:rPr>
-          <w:rFonts w:ascii="Consolas" w:hAnsi="Consolas"/>
-          <w:sz w:val="18"/>
-        </w:rPr>
-        <w:t xml:space="preserve">             onChange={(e) =&gt; setValue(Number(e.target.value))} /&gt;</w:t>
-      </w:r>
-    </w:p>
-    <w:p>
-      <w:pPr>
-        <w:spacing w:after="0" w:before="0" w:line="240" w:lineRule="auto"/>
-        <w:ind w:left="283"/>
-        <w:shd w:val="clear" w:color="auto" w:fill="F2F2F2"/>
-      </w:pPr>
-      <w:r>
-        <w:rPr>
-          <w:rFonts w:ascii="Consolas" w:hAnsi="Consolas"/>
-          <w:sz w:val="18"/>
-        </w:rPr>
-        <w:t xml:space="preserve">      &lt;HorizontalBarGraph value={value} maxvalue={100} barwidthpx={420} label="Fortschritt" /&gt;</w:t>
-      </w:r>
-    </w:p>
-    <w:p>
-      <w:pPr>
-        <w:spacing w:after="0" w:before="0" w:line="240" w:lineRule="auto"/>
-        <w:ind w:left="283"/>
-        <w:shd w:val="clear" w:color="auto" w:fill="F2F2F2"/>
-      </w:pPr>
-      <w:r>
-        <w:rPr>
-          <w:rFonts w:ascii="Consolas" w:hAnsi="Consolas"/>
-          <w:sz w:val="18"/>
-        </w:rPr>
-        <w:t xml:space="preserve">      &lt;HorizontalBarGraph value={value} maxvalue={60} barwidthpx={300} label="Ziel 60" color="#16a34a" /&gt;</w:t>
-      </w:r>
-    </w:p>
-    <w:p>
-      <w:pPr>
-        <w:spacing w:after="0" w:before="0" w:line="240" w:lineRule="auto"/>
-        <w:ind w:left="283"/>
-        <w:shd w:val="clear" w:color="auto" w:fill="F2F2F2"/>
-      </w:pPr>
-      <w:r>
-        <w:rPr>
-          <w:rFonts w:ascii="Consolas" w:hAnsi="Consolas"/>
-          <w:sz w:val="18"/>
-        </w:rPr>
-        <w:t xml:space="preserve">    &lt;/&gt;</w:t>
-      </w:r>
-    </w:p>
-    <w:p>
-      <w:pPr>
-        <w:spacing w:after="0" w:before="0" w:line="240" w:lineRule="auto"/>
-        <w:ind w:left="283"/>
-        <w:shd w:val="clear" w:color="auto" w:fill="F2F2F2"/>
-      </w:pPr>
-      <w:r>
-        <w:rPr>
-          <w:rFonts w:ascii="Consolas" w:hAnsi="Consolas"/>
-          <w:sz w:val="18"/>
-        </w:rPr>
-        <w:t xml:space="preserve">  )</w:t>
-      </w:r>
-    </w:p>
-    <w:p>
-      <w:pPr>
-        <w:spacing w:after="160" w:before="0" w:line="240" w:lineRule="auto"/>
-        <w:ind w:left="283"/>
-        <w:shd w:val="clear" w:color="auto" w:fill="F2F2F2"/>
-      </w:pPr>
-      <w:r>
-        <w:rPr>
-          <w:rFonts w:ascii="Consolas" w:hAnsi="Consolas"/>
-          <w:sz w:val="18"/>
-        </w:rPr>
-        <w:t>}</w:t>
-      </w:r>
-    </w:p>
-    <w:p>
-      <w:pPr>
-        <w:spacing w:after="120"/>
-      </w:pPr>
-      <w:r>
-        <w:rPr>
-          <w:b w:val="0"/>
-          <w:i w:val="0"/>
-        </w:rPr>
-        <w:t>In der package.json des Konsumenten steht danach "@johnsoryna/mybargraph": "^1.0.0". Das CSS muss nicht separat importiert werden, weil es im Bundle injiziert ist.</w:t>
-      </w:r>
-    </w:p>
-    <w:p>
-      <w:pPr>
-        <w:spacing w:before="200" w:after="40"/>
-        <w:jc w:val="center"/>
-      </w:pPr>
-      <w:r>
-        <w:rPr>
-          <w:b/>
-          <w:highlight w:val="yellow"/>
-        </w:rPr>
-        <w:t>[Screenshot einfuegen: screenshots/explorer_node_modules.png]</w:t>
-      </w:r>
-    </w:p>
-    <w:p>
-      <w:pPr>
-        <w:spacing w:after="240"/>
-        <w:jc w:val="center"/>
-      </w:pPr>
-      <w:r>
-        <w:rPr>
-          <w:i/>
-          <w:sz w:val="18"/>
-        </w:rPr>
-        <w:t>node_modules/@johnsoryna/mybargraph im Konsumenten-Projekt: nur dist/, README und package.json</w:t>
-      </w:r>
-    </w:p>
-    <w:p>
-      <w:pPr>
         <w:jc w:val="center"/>
       </w:pPr>
       <w:r>
         <w:drawing>
           <wp:inline xmlns:a="http://schemas.openxmlformats.org/drawingml/2006/main" xmlns:pic="http://schemas.openxmlformats.org/drawingml/2006/picture">
             <wp:extent cx="5580000" cy="2711709"/>
-            <wp:docPr id="2" name="Picture 2"/>
+            <wp:docPr id="4" name="Picture 4"/>
             <wp:cNvGraphicFramePr>
               <a:graphicFrameLocks noChangeAspect="1"/>
             </wp:cNvGraphicFramePr>
@@ -4260,11 +3924,11 @@
               <a:graphicData uri="http://schemas.openxmlformats.org/drawingml/2006/picture">
                 <pic:pic>
                   <pic:nvPicPr>
-                    <pic:cNvPr id="0" name="consumer_browser.jpg"/>
+                    <pic:cNvPr id="0" name="npmjs_package.jpg"/>
                     <pic:cNvPicPr/>
                   </pic:nvPicPr>
                   <pic:blipFill>
-                    <a:blip r:embed="rId10"/>
+                    <a:blip r:embed="rId12"/>
                     <a:stretch>
                       <a:fillRect/>
                     </a:stretch>
@@ -4293,6 +3957,472 @@
           <w:i/>
           <w:sz w:val="18"/>
         </w:rPr>
+        <w:t>Das Package @johnsoryna/mybargraph auf npmjs.com, Version 1.0.0, public, mit Link zum Repository</w:t>
+      </w:r>
+    </w:p>
+    <w:p>
+      <w:pPr>
+        <w:jc w:val="center"/>
+      </w:pPr>
+      <w:r>
+        <w:drawing>
+          <wp:inline xmlns:a="http://schemas.openxmlformats.org/drawingml/2006/main" xmlns:pic="http://schemas.openxmlformats.org/drawingml/2006/picture">
+            <wp:extent cx="5580000" cy="2711709"/>
+            <wp:docPr id="5" name="Picture 5"/>
+            <wp:cNvGraphicFramePr>
+              <a:graphicFrameLocks noChangeAspect="1"/>
+            </wp:cNvGraphicFramePr>
+            <a:graphic>
+              <a:graphicData uri="http://schemas.openxmlformats.org/drawingml/2006/picture">
+                <pic:pic>
+                  <pic:nvPicPr>
+                    <pic:cNvPr id="0" name="github_repo.jpg"/>
+                    <pic:cNvPicPr/>
+                  </pic:nvPicPr>
+                  <pic:blipFill>
+                    <a:blip r:embed="rId13"/>
+                    <a:stretch>
+                      <a:fillRect/>
+                    </a:stretch>
+                  </pic:blipFill>
+                  <pic:spPr>
+                    <a:xfrm>
+                      <a:off x="0" y="0"/>
+                      <a:ext cx="5580000" cy="2711709"/>
+                    </a:xfrm>
+                    <a:prstGeom prst="rect"/>
+                  </pic:spPr>
+                </pic:pic>
+              </a:graphicData>
+            </a:graphic>
+          </wp:inline>
+        </w:drawing>
+      </w:r>
+    </w:p>
+    <w:p>
+      <w:pPr>
+        <w:spacing w:after="240"/>
+        <w:jc w:val="center"/>
+      </w:pPr>
+      <w:r>
+        <w:rPr>
+          <w:i/>
+          <w:sz w:val="18"/>
+        </w:rPr>
+        <w:t>Quellcode-Repository m324-react-bargraph auf GitHub</w:t>
+      </w:r>
+    </w:p>
+    <w:p>
+      <w:pPr>
+        <w:spacing w:after="120"/>
+      </w:pPr>
+      <w:r>
+        <w:rPr>
+          <w:b w:val="0"/>
+          <w:i w:val="0"/>
+        </w:rPr>
+        <w:t>Eine publizierte Version ist unveränderlich. Für jede weitere Publikation muss die Version erhöht werden, z.B. mit npm version patch (1.0.0 -&gt; 1.0.1), erst dann geht npm publish wieder durch.</w:t>
+      </w:r>
+    </w:p>
+    <w:p>
+      <w:pPr>
+        <w:pStyle w:val="Heading1"/>
+      </w:pPr>
+      <w:r>
+        <w:t>Aufgabe: Package im eigenen Projekt verwenden</w:t>
+      </w:r>
+    </w:p>
+    <w:p>
+      <w:pPr>
+        <w:spacing w:after="120"/>
+      </w:pPr>
+      <w:r>
+        <w:rPr>
+          <w:b w:val="0"/>
+          <w:i w:val="0"/>
+        </w:rPr>
+        <w:t>Zweites Projekt bargraph-consumer, ebenfalls mit Vite und React. Das Package wird wie jede andere Abhängigkeit installiert und landet unter node_modules/@johnsoryna/mybargraph, nur mit dist/, README und package.json, ohne Quellcode.</w:t>
+      </w:r>
+    </w:p>
+    <w:p>
+      <w:pPr>
+        <w:spacing w:after="0" w:before="0" w:line="240" w:lineRule="auto"/>
+        <w:ind w:left="283"/>
+        <w:shd w:val="clear" w:color="auto" w:fill="F2F2F2"/>
+      </w:pPr>
+      <w:r>
+        <w:rPr>
+          <w:rFonts w:ascii="Consolas" w:hAnsi="Consolas"/>
+          <w:sz w:val="18"/>
+        </w:rPr>
+        <w:t>npm create vite@latest bargraph-consumer -- --template react</w:t>
+      </w:r>
+    </w:p>
+    <w:p>
+      <w:pPr>
+        <w:spacing w:after="0" w:before="0" w:line="240" w:lineRule="auto"/>
+        <w:ind w:left="283"/>
+        <w:shd w:val="clear" w:color="auto" w:fill="F2F2F2"/>
+      </w:pPr>
+      <w:r>
+        <w:rPr>
+          <w:rFonts w:ascii="Consolas" w:hAnsi="Consolas"/>
+          <w:sz w:val="18"/>
+        </w:rPr>
+        <w:t>cd bargraph-consumer</w:t>
+      </w:r>
+    </w:p>
+    <w:p>
+      <w:pPr>
+        <w:spacing w:after="0" w:before="0" w:line="240" w:lineRule="auto"/>
+        <w:ind w:left="283"/>
+        <w:shd w:val="clear" w:color="auto" w:fill="F2F2F2"/>
+      </w:pPr>
+      <w:r>
+        <w:rPr>
+          <w:rFonts w:ascii="Consolas" w:hAnsi="Consolas"/>
+          <w:sz w:val="18"/>
+        </w:rPr>
+        <w:t>npm install</w:t>
+      </w:r>
+    </w:p>
+    <w:p>
+      <w:pPr>
+        <w:spacing w:after="160" w:before="0" w:line="240" w:lineRule="auto"/>
+        <w:ind w:left="283"/>
+        <w:shd w:val="clear" w:color="auto" w:fill="F2F2F2"/>
+      </w:pPr>
+      <w:r>
+        <w:rPr>
+          <w:rFonts w:ascii="Consolas" w:hAnsi="Consolas"/>
+          <w:sz w:val="18"/>
+        </w:rPr>
+        <w:t>npm install @johnsoryna/mybargraph</w:t>
+      </w:r>
+    </w:p>
+    <w:p>
+      <w:pPr>
+        <w:spacing w:after="0" w:before="0" w:line="240" w:lineRule="auto"/>
+        <w:ind w:left="283"/>
+        <w:shd w:val="clear" w:color="auto" w:fill="F2F2F2"/>
+      </w:pPr>
+      <w:r>
+        <w:rPr>
+          <w:rFonts w:ascii="Consolas" w:hAnsi="Consolas"/>
+          <w:sz w:val="18"/>
+        </w:rPr>
+        <w:t>// src/App.jsx (gekuerzt)</w:t>
+      </w:r>
+    </w:p>
+    <w:p>
+      <w:pPr>
+        <w:spacing w:after="0" w:before="0" w:line="240" w:lineRule="auto"/>
+        <w:ind w:left="283"/>
+        <w:shd w:val="clear" w:color="auto" w:fill="F2F2F2"/>
+      </w:pPr>
+      <w:r>
+        <w:rPr>
+          <w:rFonts w:ascii="Consolas" w:hAnsi="Consolas"/>
+          <w:sz w:val="18"/>
+        </w:rPr>
+        <w:t>import { useState } from 'react'</w:t>
+      </w:r>
+    </w:p>
+    <w:p>
+      <w:pPr>
+        <w:spacing w:after="0" w:before="0" w:line="240" w:lineRule="auto"/>
+        <w:ind w:left="283"/>
+        <w:shd w:val="clear" w:color="auto" w:fill="F2F2F2"/>
+      </w:pPr>
+      <w:r>
+        <w:rPr>
+          <w:rFonts w:ascii="Consolas" w:hAnsi="Consolas"/>
+          <w:sz w:val="18"/>
+        </w:rPr>
+        <w:t>import HorizontalBarGraph from '@johnsoryna/mybargraph'</w:t>
+      </w:r>
+    </w:p>
+    <w:p>
+      <w:pPr>
+        <w:spacing w:after="0" w:before="0" w:line="240" w:lineRule="auto"/>
+        <w:ind w:left="283"/>
+        <w:shd w:val="clear" w:color="auto" w:fill="F2F2F2"/>
+      </w:pPr>
+      <w:r>
+        <w:rPr>
+          <w:rFonts w:ascii="Consolas" w:hAnsi="Consolas"/>
+          <w:sz w:val="18"/>
+        </w:rPr>
+        <w:t xml:space="preserve"> </w:t>
+      </w:r>
+    </w:p>
+    <w:p>
+      <w:pPr>
+        <w:spacing w:after="0" w:before="0" w:line="240" w:lineRule="auto"/>
+        <w:ind w:left="283"/>
+        <w:shd w:val="clear" w:color="auto" w:fill="F2F2F2"/>
+      </w:pPr>
+      <w:r>
+        <w:rPr>
+          <w:rFonts w:ascii="Consolas" w:hAnsi="Consolas"/>
+          <w:sz w:val="18"/>
+        </w:rPr>
+        <w:t>function App() {</w:t>
+      </w:r>
+    </w:p>
+    <w:p>
+      <w:pPr>
+        <w:spacing w:after="0" w:before="0" w:line="240" w:lineRule="auto"/>
+        <w:ind w:left="283"/>
+        <w:shd w:val="clear" w:color="auto" w:fill="F2F2F2"/>
+      </w:pPr>
+      <w:r>
+        <w:rPr>
+          <w:rFonts w:ascii="Consolas" w:hAnsi="Consolas"/>
+          <w:sz w:val="18"/>
+        </w:rPr>
+        <w:t xml:space="preserve">  const [value, setValue] = useState(42)</w:t>
+      </w:r>
+    </w:p>
+    <w:p>
+      <w:pPr>
+        <w:spacing w:after="0" w:before="0" w:line="240" w:lineRule="auto"/>
+        <w:ind w:left="283"/>
+        <w:shd w:val="clear" w:color="auto" w:fill="F2F2F2"/>
+      </w:pPr>
+      <w:r>
+        <w:rPr>
+          <w:rFonts w:ascii="Consolas" w:hAnsi="Consolas"/>
+          <w:sz w:val="18"/>
+        </w:rPr>
+        <w:t xml:space="preserve">  return (</w:t>
+      </w:r>
+    </w:p>
+    <w:p>
+      <w:pPr>
+        <w:spacing w:after="0" w:before="0" w:line="240" w:lineRule="auto"/>
+        <w:ind w:left="283"/>
+        <w:shd w:val="clear" w:color="auto" w:fill="F2F2F2"/>
+      </w:pPr>
+      <w:r>
+        <w:rPr>
+          <w:rFonts w:ascii="Consolas" w:hAnsi="Consolas"/>
+          <w:sz w:val="18"/>
+        </w:rPr>
+        <w:t xml:space="preserve">    &lt;&gt;</w:t>
+      </w:r>
+    </w:p>
+    <w:p>
+      <w:pPr>
+        <w:spacing w:after="0" w:before="0" w:line="240" w:lineRule="auto"/>
+        <w:ind w:left="283"/>
+        <w:shd w:val="clear" w:color="auto" w:fill="F2F2F2"/>
+      </w:pPr>
+      <w:r>
+        <w:rPr>
+          <w:rFonts w:ascii="Consolas" w:hAnsi="Consolas"/>
+          <w:sz w:val="18"/>
+        </w:rPr>
+        <w:t xml:space="preserve">      &lt;input type="range" min="0" max="100" value={value}</w:t>
+      </w:r>
+    </w:p>
+    <w:p>
+      <w:pPr>
+        <w:spacing w:after="0" w:before="0" w:line="240" w:lineRule="auto"/>
+        <w:ind w:left="283"/>
+        <w:shd w:val="clear" w:color="auto" w:fill="F2F2F2"/>
+      </w:pPr>
+      <w:r>
+        <w:rPr>
+          <w:rFonts w:ascii="Consolas" w:hAnsi="Consolas"/>
+          <w:sz w:val="18"/>
+        </w:rPr>
+        <w:t xml:space="preserve">             onChange={(e) =&gt; setValue(Number(e.target.value))} /&gt;</w:t>
+      </w:r>
+    </w:p>
+    <w:p>
+      <w:pPr>
+        <w:spacing w:after="0" w:before="0" w:line="240" w:lineRule="auto"/>
+        <w:ind w:left="283"/>
+        <w:shd w:val="clear" w:color="auto" w:fill="F2F2F2"/>
+      </w:pPr>
+      <w:r>
+        <w:rPr>
+          <w:rFonts w:ascii="Consolas" w:hAnsi="Consolas"/>
+          <w:sz w:val="18"/>
+        </w:rPr>
+        <w:t xml:space="preserve">      &lt;HorizontalBarGraph value={value} maxvalue={100} barwidthpx={420} label="Fortschritt" /&gt;</w:t>
+      </w:r>
+    </w:p>
+    <w:p>
+      <w:pPr>
+        <w:spacing w:after="0" w:before="0" w:line="240" w:lineRule="auto"/>
+        <w:ind w:left="283"/>
+        <w:shd w:val="clear" w:color="auto" w:fill="F2F2F2"/>
+      </w:pPr>
+      <w:r>
+        <w:rPr>
+          <w:rFonts w:ascii="Consolas" w:hAnsi="Consolas"/>
+          <w:sz w:val="18"/>
+        </w:rPr>
+        <w:t xml:space="preserve">      &lt;HorizontalBarGraph value={value} maxvalue={60} barwidthpx={300} label="Ziel 60" color="#16a34a" /&gt;</w:t>
+      </w:r>
+    </w:p>
+    <w:p>
+      <w:pPr>
+        <w:spacing w:after="0" w:before="0" w:line="240" w:lineRule="auto"/>
+        <w:ind w:left="283"/>
+        <w:shd w:val="clear" w:color="auto" w:fill="F2F2F2"/>
+      </w:pPr>
+      <w:r>
+        <w:rPr>
+          <w:rFonts w:ascii="Consolas" w:hAnsi="Consolas"/>
+          <w:sz w:val="18"/>
+        </w:rPr>
+        <w:t xml:space="preserve">    &lt;/&gt;</w:t>
+      </w:r>
+    </w:p>
+    <w:p>
+      <w:pPr>
+        <w:spacing w:after="0" w:before="0" w:line="240" w:lineRule="auto"/>
+        <w:ind w:left="283"/>
+        <w:shd w:val="clear" w:color="auto" w:fill="F2F2F2"/>
+      </w:pPr>
+      <w:r>
+        <w:rPr>
+          <w:rFonts w:ascii="Consolas" w:hAnsi="Consolas"/>
+          <w:sz w:val="18"/>
+        </w:rPr>
+        <w:t xml:space="preserve">  )</w:t>
+      </w:r>
+    </w:p>
+    <w:p>
+      <w:pPr>
+        <w:spacing w:after="160" w:before="0" w:line="240" w:lineRule="auto"/>
+        <w:ind w:left="283"/>
+        <w:shd w:val="clear" w:color="auto" w:fill="F2F2F2"/>
+      </w:pPr>
+      <w:r>
+        <w:rPr>
+          <w:rFonts w:ascii="Consolas" w:hAnsi="Consolas"/>
+          <w:sz w:val="18"/>
+        </w:rPr>
+        <w:t>}</w:t>
+      </w:r>
+    </w:p>
+    <w:p>
+      <w:pPr>
+        <w:spacing w:after="120"/>
+      </w:pPr>
+      <w:r>
+        <w:rPr>
+          <w:b w:val="0"/>
+          <w:i w:val="0"/>
+        </w:rPr>
+        <w:t>In der package.json des Konsumenten steht danach "@johnsoryna/mybargraph": "^1.0.0". Das CSS muss nicht separat importiert werden, weil es im Bundle injiziert ist.</w:t>
+      </w:r>
+    </w:p>
+    <w:p>
+      <w:pPr>
+        <w:jc w:val="center"/>
+      </w:pPr>
+      <w:r>
+        <w:drawing>
+          <wp:inline xmlns:a="http://schemas.openxmlformats.org/drawingml/2006/main" xmlns:pic="http://schemas.openxmlformats.org/drawingml/2006/picture">
+            <wp:extent cx="5580000" cy="3138750"/>
+            <wp:docPr id="6" name="Picture 6"/>
+            <wp:cNvGraphicFramePr>
+              <a:graphicFrameLocks noChangeAspect="1"/>
+            </wp:cNvGraphicFramePr>
+            <a:graphic>
+              <a:graphicData uri="http://schemas.openxmlformats.org/drawingml/2006/picture">
+                <pic:pic>
+                  <pic:nvPicPr>
+                    <pic:cNvPr id="0" name="explorer_node_modules.png"/>
+                    <pic:cNvPicPr/>
+                  </pic:nvPicPr>
+                  <pic:blipFill>
+                    <a:blip r:embed="rId14"/>
+                    <a:stretch>
+                      <a:fillRect/>
+                    </a:stretch>
+                  </pic:blipFill>
+                  <pic:spPr>
+                    <a:xfrm>
+                      <a:off x="0" y="0"/>
+                      <a:ext cx="5580000" cy="3138750"/>
+                    </a:xfrm>
+                    <a:prstGeom prst="rect"/>
+                  </pic:spPr>
+                </pic:pic>
+              </a:graphicData>
+            </a:graphic>
+          </wp:inline>
+        </w:drawing>
+      </w:r>
+    </w:p>
+    <w:p>
+      <w:pPr>
+        <w:spacing w:after="240"/>
+        <w:jc w:val="center"/>
+      </w:pPr>
+      <w:r>
+        <w:rPr>
+          <w:i/>
+          <w:sz w:val="18"/>
+        </w:rPr>
+        <w:t>node_modules/@johnsoryna/mybargraph im Konsumenten-Projekt: nur dist/, README und package.json</w:t>
+      </w:r>
+    </w:p>
+    <w:p>
+      <w:pPr>
+        <w:jc w:val="center"/>
+      </w:pPr>
+      <w:r>
+        <w:drawing>
+          <wp:inline xmlns:a="http://schemas.openxmlformats.org/drawingml/2006/main" xmlns:pic="http://schemas.openxmlformats.org/drawingml/2006/picture">
+            <wp:extent cx="5580000" cy="2711709"/>
+            <wp:docPr id="7" name="Picture 7"/>
+            <wp:cNvGraphicFramePr>
+              <a:graphicFrameLocks noChangeAspect="1"/>
+            </wp:cNvGraphicFramePr>
+            <a:graphic>
+              <a:graphicData uri="http://schemas.openxmlformats.org/drawingml/2006/picture">
+                <pic:pic>
+                  <pic:nvPicPr>
+                    <pic:cNvPr id="0" name="consumer_browser.jpg"/>
+                    <pic:cNvPicPr/>
+                  </pic:nvPicPr>
+                  <pic:blipFill>
+                    <a:blip r:embed="rId15"/>
+                    <a:stretch>
+                      <a:fillRect/>
+                    </a:stretch>
+                  </pic:blipFill>
+                  <pic:spPr>
+                    <a:xfrm>
+                      <a:off x="0" y="0"/>
+                      <a:ext cx="5580000" cy="2711709"/>
+                    </a:xfrm>
+                    <a:prstGeom prst="rect"/>
+                  </pic:spPr>
+                </pic:pic>
+              </a:graphicData>
+            </a:graphic>
+          </wp:inline>
+        </w:drawing>
+      </w:r>
+    </w:p>
+    <w:p>
+      <w:pPr>
+        <w:spacing w:after="240"/>
+        <w:jc w:val="center"/>
+      </w:pPr>
+      <w:r>
+        <w:rPr>
+          <w:i/>
+          <w:sz w:val="18"/>
+        </w:rPr>
         <w:t>npm run dev im Konsumenten: HorizontalBarGraph aus dem npm-Package</w:t>
       </w:r>
     </w:p>
@@ -4549,7 +4679,7 @@
         <w:pStyle w:val="Heading1"/>
       </w:pPr>
       <w:r>
-        <w:t>Anhang: Checkliste Screenshots (vor der PDF-Abgabe entfernen)</w:t>
+        <w:t>Anhang: Offene Punkte (vor der PDF-Abgabe entfernen)</w:t>
       </w:r>
     </w:p>
     <w:p>
@@ -4561,7 +4691,7 @@
           <w:b w:val="0"/>
           <w:i w:val="0"/>
         </w:rPr>
-        <w:t>Dateien nach doku/screenshots/ legen und python build_doku.py erneut ausführen, dann werden sie automatisch eingebettet.</w:t>
+        <w:t>Sobald das Package des Lernpartners bekannt ist: installieren, in src/PartnerDemo.jsx einbinden, die gelben Platzhalter im Abschnitt Lernpartner ersetzen, diese zwei Screenshots nach doku/screenshots/ legen und python build_doku.py erneut ausführen.</w:t>
       </w:r>
     </w:p>
     <w:tbl>
@@ -4621,314 +4751,6 @@
                 <w:sz w:val="20"/>
               </w:rPr>
               <w:t>Wo</w:t>
-            </w:r>
-          </w:p>
-        </w:tc>
-      </w:tr>
-      <w:tr>
-        <w:tc>
-          <w:tcPr>
-            <w:tcW w:type="dxa" w:w="2551"/>
-          </w:tcPr>
-          <w:p>
-            <w:r/>
-            <w:r>
-              <w:rPr>
-                <w:sz w:val="20"/>
-              </w:rPr>
-              <w:t>intellij_projekt.png</w:t>
-            </w:r>
-          </w:p>
-        </w:tc>
-        <w:tc>
-          <w:tcPr>
-            <w:tcW w:type="dxa" w:w="4252"/>
-          </w:tcPr>
-          <w:p>
-            <w:r/>
-            <w:r>
-              <w:rPr>
-                <w:sz w:val="20"/>
-              </w:rPr>
-              <w:t>IntelliJ mit Projektbaum von mybargraph (src, demo, dist, package.json)</w:t>
-            </w:r>
-          </w:p>
-        </w:tc>
-        <w:tc>
-          <w:tcPr>
-            <w:tcW w:type="dxa" w:w="2268"/>
-          </w:tcPr>
-          <w:p>
-            <w:r/>
-            <w:r>
-              <w:rPr>
-                <w:sz w:val="20"/>
-              </w:rPr>
-              <w:t>Package erstellen, Schritt 1</w:t>
-            </w:r>
-          </w:p>
-        </w:tc>
-      </w:tr>
-      <w:tr>
-        <w:tc>
-          <w:tcPr>
-            <w:tcW w:type="dxa" w:w="2551"/>
-          </w:tcPr>
-          <w:p>
-            <w:r/>
-            <w:r>
-              <w:rPr>
-                <w:sz w:val="20"/>
-              </w:rPr>
-              <w:t>term_build.png</w:t>
-            </w:r>
-          </w:p>
-        </w:tc>
-        <w:tc>
-          <w:tcPr>
-            <w:tcW w:type="dxa" w:w="4252"/>
-          </w:tcPr>
-          <w:p>
-            <w:r/>
-            <w:r>
-              <w:rPr>
-                <w:sz w:val="20"/>
-              </w:rPr>
-              <w:t>Terminal: npm run build und npm pack --dry-run</w:t>
-            </w:r>
-          </w:p>
-        </w:tc>
-        <w:tc>
-          <w:tcPr>
-            <w:tcW w:type="dxa" w:w="2268"/>
-          </w:tcPr>
-          <w:p>
-            <w:r/>
-            <w:r>
-              <w:rPr>
-                <w:sz w:val="20"/>
-              </w:rPr>
-              <w:t>Package erstellen, Schritt 6/7</w:t>
-            </w:r>
-          </w:p>
-        </w:tc>
-      </w:tr>
-      <w:tr>
-        <w:tc>
-          <w:tcPr>
-            <w:tcW w:type="dxa" w:w="2551"/>
-          </w:tcPr>
-          <w:p>
-            <w:r/>
-            <w:r>
-              <w:rPr>
-                <w:sz w:val="20"/>
-              </w:rPr>
-              <w:t>demo_browser.png</w:t>
-            </w:r>
-          </w:p>
-        </w:tc>
-        <w:tc>
-          <w:tcPr>
-            <w:tcW w:type="dxa" w:w="4252"/>
-          </w:tcPr>
-          <w:p>
-            <w:r/>
-            <w:r>
-              <w:rPr>
-                <w:sz w:val="20"/>
-              </w:rPr>
-              <w:t>Browser: npm run demo mit Slider und Balken</w:t>
-            </w:r>
-          </w:p>
-        </w:tc>
-        <w:tc>
-          <w:tcPr>
-            <w:tcW w:type="dxa" w:w="2268"/>
-          </w:tcPr>
-          <w:p>
-            <w:r/>
-            <w:r>
-              <w:rPr>
-                <w:sz w:val="20"/>
-              </w:rPr>
-              <w:t>Demo</w:t>
-            </w:r>
-          </w:p>
-        </w:tc>
-      </w:tr>
-      <w:tr>
-        <w:tc>
-          <w:tcPr>
-            <w:tcW w:type="dxa" w:w="2551"/>
-          </w:tcPr>
-          <w:p>
-            <w:r/>
-            <w:r>
-              <w:rPr>
-                <w:sz w:val="20"/>
-              </w:rPr>
-              <w:t>term_publish.png</w:t>
-            </w:r>
-          </w:p>
-        </w:tc>
-        <w:tc>
-          <w:tcPr>
-            <w:tcW w:type="dxa" w:w="4252"/>
-          </w:tcPr>
-          <w:p>
-            <w:r/>
-            <w:r>
-              <w:rPr>
-                <w:sz w:val="20"/>
-              </w:rPr>
-              <w:t>Terminal: npm whoami und npm publish --access public</w:t>
-            </w:r>
-          </w:p>
-        </w:tc>
-        <w:tc>
-          <w:tcPr>
-            <w:tcW w:type="dxa" w:w="2268"/>
-          </w:tcPr>
-          <w:p>
-            <w:r/>
-            <w:r>
-              <w:rPr>
-                <w:sz w:val="20"/>
-              </w:rPr>
-              <w:t>Publizieren</w:t>
-            </w:r>
-          </w:p>
-        </w:tc>
-      </w:tr>
-      <w:tr>
-        <w:tc>
-          <w:tcPr>
-            <w:tcW w:type="dxa" w:w="2551"/>
-          </w:tcPr>
-          <w:p>
-            <w:r/>
-            <w:r>
-              <w:rPr>
-                <w:sz w:val="20"/>
-              </w:rPr>
-              <w:t>npmjs_package.png</w:t>
-            </w:r>
-          </w:p>
-        </w:tc>
-        <w:tc>
-          <w:tcPr>
-            <w:tcW w:type="dxa" w:w="4252"/>
-          </w:tcPr>
-          <w:p>
-            <w:r/>
-            <w:r>
-              <w:rPr>
-                <w:sz w:val="20"/>
-              </w:rPr>
-              <w:t>Browser: npmjs.com/package/@johnsoryna/mybargraph</w:t>
-            </w:r>
-          </w:p>
-        </w:tc>
-        <w:tc>
-          <w:tcPr>
-            <w:tcW w:type="dxa" w:w="2268"/>
-          </w:tcPr>
-          <w:p>
-            <w:r/>
-            <w:r>
-              <w:rPr>
-                <w:sz w:val="20"/>
-              </w:rPr>
-              <w:t>Publizieren</w:t>
-            </w:r>
-          </w:p>
-        </w:tc>
-      </w:tr>
-      <w:tr>
-        <w:tc>
-          <w:tcPr>
-            <w:tcW w:type="dxa" w:w="2551"/>
-          </w:tcPr>
-          <w:p>
-            <w:r/>
-            <w:r>
-              <w:rPr>
-                <w:sz w:val="20"/>
-              </w:rPr>
-              <w:t>explorer_node_modules.png</w:t>
-            </w:r>
-          </w:p>
-        </w:tc>
-        <w:tc>
-          <w:tcPr>
-            <w:tcW w:type="dxa" w:w="4252"/>
-          </w:tcPr>
-          <w:p>
-            <w:r/>
-            <w:r>
-              <w:rPr>
-                <w:sz w:val="20"/>
-              </w:rPr>
-              <w:t>Explorer/IntelliJ: node_modules/@johnsoryna/mybargraph/dist im Konsumenten</w:t>
-            </w:r>
-          </w:p>
-        </w:tc>
-        <w:tc>
-          <w:tcPr>
-            <w:tcW w:type="dxa" w:w="2268"/>
-          </w:tcPr>
-          <w:p>
-            <w:r/>
-            <w:r>
-              <w:rPr>
-                <w:sz w:val="20"/>
-              </w:rPr>
-              <w:t>Verwenden</w:t>
-            </w:r>
-          </w:p>
-        </w:tc>
-      </w:tr>
-      <w:tr>
-        <w:tc>
-          <w:tcPr>
-            <w:tcW w:type="dxa" w:w="2551"/>
-          </w:tcPr>
-          <w:p>
-            <w:r/>
-            <w:r>
-              <w:rPr>
-                <w:sz w:val="20"/>
-              </w:rPr>
-              <w:t>consumer_browser.png</w:t>
-            </w:r>
-          </w:p>
-        </w:tc>
-        <w:tc>
-          <w:tcPr>
-            <w:tcW w:type="dxa" w:w="4252"/>
-          </w:tcPr>
-          <w:p>
-            <w:r/>
-            <w:r>
-              <w:rPr>
-                <w:sz w:val="20"/>
-              </w:rPr>
-              <w:t>Browser: bargraph-consumer mit npm run dev</w:t>
-            </w:r>
-          </w:p>
-        </w:tc>
-        <w:tc>
-          <w:tcPr>
-            <w:tcW w:type="dxa" w:w="2268"/>
-          </w:tcPr>
-          <w:p>
-            <w:r/>
-            <w:r>
-              <w:rPr>
-                <w:sz w:val="20"/>
-              </w:rPr>
-              <w:t>Verwenden</w:t>
             </w:r>
           </w:p>
         </w:tc>

</xml_diff>

<commit_message>
Doku: Abschnitt Lernpartner (GitHub Packages, privater Zugriff) ergaenzt
Co-Authored-By: Claude Fable 5.1 <noreply@anthropic.com>
Claude-Session: https://claude.ai/code/session_01LrLPuYCXBtmrXtoqs5tDFr
</commit_message>
<xml_diff>
--- a/doku/M324_React_Package_Johnny_Leonhardt.docx
+++ b/doku/M324_React_Package_Johnny_Leonhardt.docx
@@ -4440,11 +4440,10 @@
       </w:pPr>
       <w:r>
         <w:rPr>
-          <w:b/>
+          <w:b w:val="0"/>
           <w:i w:val="0"/>
-          <w:highlight w:val="yellow"/>
         </w:rPr>
-        <w:t>Lernpartner: [NAME]   Package: [@PARTNER/PAKETNAME]   Registry: [npmjs.com / GitHub Packages]</w:t>
+        <w:t>Lernpartner: GitHub-Benutzer Samusn. Package: @samusn/react-card-package, Version 1.0.0, publiziert auf GitHub Packages (github.com/Samusn/react-card-package/pkgs/npm/react-card-package).</w:t>
       </w:r>
     </w:p>
     <w:p>
@@ -4456,7 +4455,7 @@
           <w:b w:val="0"/>
           <w:i w:val="0"/>
         </w:rPr>
-        <w:t>Das Package des Lernpartners wird im gleichen Konsumenten-Projekt installiert und in src/PartnerDemo.jsx verwendet. Die Datei enthält bereits die vorbereitete Stelle:</w:t>
+        <w:t>Damit ist genau der Fall aus der Recherche oben eingetreten: Das Package liegt nicht auf npmjs.com, sondern in der GitHub-Registry. npm install würde es dort gar nicht suchen. Im Konsumenten braucht es deshalb eine .npmrc, die den Scope @samusn auf npm.pkg.github.com umleitet und ein Token mitgibt. Das Token steht nur in der Umgebungsvariable GITHUB_TOKEN, die .npmrc selbst kann ins Repository, wie die settings.xml bei Maven mit ${env.GITHUB_TOKEN}.</w:t>
       </w:r>
     </w:p>
     <w:p>
@@ -4470,7 +4469,35 @@
           <w:rFonts w:ascii="Consolas" w:hAnsi="Consolas"/>
           <w:sz w:val="18"/>
         </w:rPr>
-        <w:t>npm install @PARTNER/PAKETNAME</w:t>
+        <w:t># bargraph-consumer/.npmrc</w:t>
+      </w:r>
+    </w:p>
+    <w:p>
+      <w:pPr>
+        <w:spacing w:after="0" w:before="0" w:line="240" w:lineRule="auto"/>
+        <w:ind w:left="283"/>
+        <w:shd w:val="clear" w:color="auto" w:fill="F2F2F2"/>
+      </w:pPr>
+      <w:r>
+        <w:rPr>
+          <w:rFonts w:ascii="Consolas" w:hAnsi="Consolas"/>
+          <w:sz w:val="18"/>
+        </w:rPr>
+        <w:t>@samusn:registry=https://npm.pkg.github.com</w:t>
+      </w:r>
+    </w:p>
+    <w:p>
+      <w:pPr>
+        <w:spacing w:after="0" w:before="0" w:line="240" w:lineRule="auto"/>
+        <w:ind w:left="283"/>
+        <w:shd w:val="clear" w:color="auto" w:fill="F2F2F2"/>
+      </w:pPr>
+      <w:r>
+        <w:rPr>
+          <w:rFonts w:ascii="Consolas" w:hAnsi="Consolas"/>
+          <w:sz w:val="18"/>
+        </w:rPr>
+        <w:t>//npm.pkg.github.com/:_authToken=${GITHUB_TOKEN}</w:t>
       </w:r>
     </w:p>
     <w:p>
@@ -4498,7 +4525,7 @@
           <w:rFonts w:ascii="Consolas" w:hAnsi="Consolas"/>
           <w:sz w:val="18"/>
         </w:rPr>
-        <w:t>// src/PartnerDemo.jsx</w:t>
+        <w:t># PowerShell: Token aus der GitHub-CLI uebernehmen, dann installieren</w:t>
       </w:r>
     </w:p>
     <w:p>
@@ -4512,7 +4539,74 @@
           <w:rFonts w:ascii="Consolas" w:hAnsi="Consolas"/>
           <w:sz w:val="18"/>
         </w:rPr>
-        <w:t>import PartnerKomponente from '@PARTNER/PAKETNAME'</w:t>
+        <w:t>$env:GITHUB_TOKEN = gh auth token</w:t>
+      </w:r>
+    </w:p>
+    <w:p>
+      <w:pPr>
+        <w:spacing w:after="160" w:before="0" w:line="240" w:lineRule="auto"/>
+        <w:ind w:left="283"/>
+        <w:shd w:val="clear" w:color="auto" w:fill="F2F2F2"/>
+      </w:pPr>
+      <w:r>
+        <w:rPr>
+          <w:rFonts w:ascii="Consolas" w:hAnsi="Consolas"/>
+          <w:sz w:val="18"/>
+        </w:rPr>
+        <w:t>npm install @samusn/react-card-package@1.0.0</w:t>
+      </w:r>
+    </w:p>
+    <w:p>
+      <w:pPr>
+        <w:spacing w:after="120"/>
+      </w:pPr>
+      <w:r>
+        <w:rPr>
+          <w:b w:val="0"/>
+          <w:i w:val="0"/>
+        </w:rPr>
+        <w:t>Erster Versuch: Die Registry antwortet mit 403 "permission_denied: read_package". Das Package und das Repository sind privat, mein GitHub-Konto hat keinen Lesezugriff. Bei GitHub Packages folgt die Sichtbarkeit eines npm-Packages dem verknüpften Repository. Der Partner muss das Package auf public stellen oder mich als Collaborator im Repository eintragen. Auf npmjs.com wäre dieser Schritt nicht nötig gewesen.</w:t>
+      </w:r>
+    </w:p>
+    <w:p>
+      <w:pPr>
+        <w:spacing w:after="120"/>
+      </w:pPr>
+      <w:r>
+        <w:rPr>
+          <w:b/>
+          <w:i w:val="0"/>
+          <w:highlight w:val="yellow"/>
+        </w:rPr>
+        <w:t>[Nach Freigabe ergänzen: Ausgabe von npm install, Komponente und Props aus dem README des Partners, Screenshot]</w:t>
+      </w:r>
+    </w:p>
+    <w:p>
+      <w:pPr>
+        <w:spacing w:after="0" w:before="0" w:line="240" w:lineRule="auto"/>
+        <w:ind w:left="283"/>
+        <w:shd w:val="clear" w:color="auto" w:fill="F2F2F2"/>
+      </w:pPr>
+      <w:r>
+        <w:rPr>
+          <w:rFonts w:ascii="Consolas" w:hAnsi="Consolas"/>
+          <w:sz w:val="18"/>
+        </w:rPr>
+        <w:t>// src/PartnerDemo.jsx (vorbereitet)</w:t>
+      </w:r>
+    </w:p>
+    <w:p>
+      <w:pPr>
+        <w:spacing w:after="0" w:before="0" w:line="240" w:lineRule="auto"/>
+        <w:ind w:left="283"/>
+        <w:shd w:val="clear" w:color="auto" w:fill="F2F2F2"/>
+      </w:pPr>
+      <w:r>
+        <w:rPr>
+          <w:rFonts w:ascii="Consolas" w:hAnsi="Consolas"/>
+          <w:sz w:val="18"/>
+        </w:rPr>
+        <w:t>import Card from '@samusn/react-card-package'</w:t>
       </w:r>
     </w:p>
     <w:p>
@@ -4540,19 +4634,7 @@
           <w:rFonts w:ascii="Consolas" w:hAnsi="Consolas"/>
           <w:sz w:val="18"/>
         </w:rPr>
-        <w:t>&lt;PartnerKomponente prop1={...} prop2={...} /&gt;</w:t>
-      </w:r>
-    </w:p>
-    <w:p>
-      <w:pPr>
-        <w:spacing w:after="120"/>
-      </w:pPr>
-      <w:r>
-        <w:rPr>
-          <w:b w:val="0"/>
-          <w:i w:val="0"/>
-        </w:rPr>
-        <w:t>Falls der Lernpartner auf GitHub Packages publiziert hat, braucht es zusätzlich eine .npmrc im Konsumenten mit dem Scope-Mapping (@partner:registry=https://npm.pkg.github.com) und einem eigenen GitHub-Token mit read:packages, siehe Recherche oben.</w:t>
+        <w:t>&lt;Card title="Beispiel" /&gt;</w:t>
       </w:r>
     </w:p>
     <w:p>

</xml_diff>

<commit_message>
Doku: Lernpartner-Package eingebunden, require-Problem und Workaround dokumentiert, Screenshots
Co-Authored-By: Claude Fable 5.1 <noreply@anthropic.com>
Claude-Session: https://claude.ai/code/session_01LrLPuYCXBtmrXtoqs5tDFr
</commit_message>
<xml_diff>
--- a/doku/M324_React_Package_Johnny_Leonhardt.docx
+++ b/doku/M324_React_Package_Johnny_Leonhardt.docx
@@ -4565,20 +4565,7 @@
           <w:b w:val="0"/>
           <w:i w:val="0"/>
         </w:rPr>
-        <w:t>Erster Versuch: Die Registry antwortet mit 403 "permission_denied: read_package". Das Package und das Repository sind privat, mein GitHub-Konto hat keinen Lesezugriff. Bei GitHub Packages folgt die Sichtbarkeit eines npm-Packages dem verknüpften Repository. Der Partner muss das Package auf public stellen oder mich als Collaborator im Repository eintragen. Auf npmjs.com wäre dieser Schritt nicht nötig gewesen.</w:t>
-      </w:r>
-    </w:p>
-    <w:p>
-      <w:pPr>
-        <w:spacing w:after="120"/>
-      </w:pPr>
-      <w:r>
-        <w:rPr>
-          <w:b/>
-          <w:i w:val="0"/>
-          <w:highlight w:val="yellow"/>
-        </w:rPr>
-        <w:t>[Nach Freigabe ergänzen: Ausgabe von npm install, Komponente und Props aus dem README des Partners, Screenshot]</w:t>
+        <w:t>Erster Versuch: Die Registry antwortet mit 403 "permission_denied: read_package". Das Repository war privat. Nachdem der Partner das Repository auf public gestellt hatte, kam immer noch 403: Bei GitHub Packages hat das Package eine eigene Sichtbarkeit (Package settings, Danger Zone, Change visibility), die nicht automatisch mit dem Repository wechselt. Erst nach diesem zweiten Schritt liess sich das Package installieren. Auf npmjs.com wäre beides nicht nötig gewesen.</w:t>
       </w:r>
     </w:p>
     <w:p>
@@ -4592,7 +4579,7 @@
           <w:rFonts w:ascii="Consolas" w:hAnsi="Consolas"/>
           <w:sz w:val="18"/>
         </w:rPr>
-        <w:t>// src/PartnerDemo.jsx (vorbereitet)</w:t>
+        <w:t>PS C:\Code\324\bargraph-consumer&gt; npm install @samusn/react-card-package@1.0.0</w:t>
       </w:r>
     </w:p>
     <w:p>
@@ -4606,7 +4593,7 @@
           <w:rFonts w:ascii="Consolas" w:hAnsi="Consolas"/>
           <w:sz w:val="18"/>
         </w:rPr>
-        <w:t>import Card from '@samusn/react-card-package'</w:t>
+        <w:t>found 0 vulnerabilities</w:t>
       </w:r>
     </w:p>
     <w:p>
@@ -4620,12 +4607,12 @@
           <w:rFonts w:ascii="Consolas" w:hAnsi="Consolas"/>
           <w:sz w:val="18"/>
         </w:rPr>
-        <w:t>...</w:t>
+        <w:t xml:space="preserve"> </w:t>
       </w:r>
     </w:p>
     <w:p>
       <w:pPr>
-        <w:spacing w:after="160" w:before="0" w:line="240" w:lineRule="auto"/>
+        <w:spacing w:after="0" w:before="0" w:line="240" w:lineRule="auto"/>
         <w:ind w:left="283"/>
         <w:shd w:val="clear" w:color="auto" w:fill="F2F2F2"/>
       </w:pPr>
@@ -4634,20 +4621,510 @@
           <w:rFonts w:ascii="Consolas" w:hAnsi="Consolas"/>
           <w:sz w:val="18"/>
         </w:rPr>
-        <w:t>&lt;Card title="Beispiel" /&gt;</w:t>
+        <w:t>package.json:      "@samusn/react-card-package": "^1.0.0"</w:t>
       </w:r>
     </w:p>
     <w:p>
       <w:pPr>
-        <w:spacing w:before="200" w:after="40"/>
-        <w:jc w:val="center"/>
+        <w:spacing w:after="0" w:before="0" w:line="240" w:lineRule="auto"/>
+        <w:ind w:left="283"/>
+        <w:shd w:val="clear" w:color="auto" w:fill="F2F2F2"/>
       </w:pPr>
       <w:r>
         <w:rPr>
-          <w:b/>
-          <w:highlight w:val="yellow"/>
+          <w:rFonts w:ascii="Consolas" w:hAnsi="Consolas"/>
+          <w:sz w:val="18"/>
         </w:rPr>
-        <w:t>[Screenshot einfuegen: screenshots/partner_browser.png]</w:t>
+        <w:t>package-lock.json: "resolved": "https://npm.pkg.github.com/download/@samusn/react-card-package/1.0.0/..."</w:t>
+      </w:r>
+    </w:p>
+    <w:p>
+      <w:pPr>
+        <w:spacing w:after="160" w:before="0" w:line="240" w:lineRule="auto"/>
+        <w:ind w:left="283"/>
+        <w:shd w:val="clear" w:color="auto" w:fill="F2F2F2"/>
+      </w:pPr>
+      <w:r>
+        <w:rPr>
+          <w:rFonts w:ascii="Consolas" w:hAnsi="Consolas"/>
+          <w:sz w:val="18"/>
+        </w:rPr>
+        <w:t>node_modules/@samusn/react-card-package/dist/react-card-package.es.js</w:t>
+      </w:r>
+    </w:p>
+    <w:p>
+      <w:pPr>
+        <w:spacing w:after="120"/>
+      </w:pPr>
+      <w:r>
+        <w:rPr>
+          <w:b w:val="0"/>
+          <w:i w:val="0"/>
+        </w:rPr>
+        <w:t>Das Package exportiert die Komponente Card (Named Export) mit den Props title, image, style und children. Ich verwende sie in src/PartnerDemo.jsx zweimal, in der zweiten Card steckt zusätzlich ein Balken aus meinem eigenen Package, damit beide Packages zusammen sichtbar sind:</w:t>
+      </w:r>
+    </w:p>
+    <w:p>
+      <w:pPr>
+        <w:spacing w:after="0" w:before="0" w:line="240" w:lineRule="auto"/>
+        <w:ind w:left="283"/>
+        <w:shd w:val="clear" w:color="auto" w:fill="F2F2F2"/>
+      </w:pPr>
+      <w:r>
+        <w:rPr>
+          <w:rFonts w:ascii="Consolas" w:hAnsi="Consolas"/>
+          <w:sz w:val="18"/>
+        </w:rPr>
+        <w:t>// src/PartnerDemo.jsx (gekuerzt)</w:t>
+      </w:r>
+    </w:p>
+    <w:p>
+      <w:pPr>
+        <w:spacing w:after="0" w:before="0" w:line="240" w:lineRule="auto"/>
+        <w:ind w:left="283"/>
+        <w:shd w:val="clear" w:color="auto" w:fill="F2F2F2"/>
+      </w:pPr>
+      <w:r>
+        <w:rPr>
+          <w:rFonts w:ascii="Consolas" w:hAnsi="Consolas"/>
+          <w:sz w:val="18"/>
+        </w:rPr>
+        <w:t>import { Card } from '@samusn/react-card-package'</w:t>
+      </w:r>
+    </w:p>
+    <w:p>
+      <w:pPr>
+        <w:spacing w:after="0" w:before="0" w:line="240" w:lineRule="auto"/>
+        <w:ind w:left="283"/>
+        <w:shd w:val="clear" w:color="auto" w:fill="F2F2F2"/>
+      </w:pPr>
+      <w:r>
+        <w:rPr>
+          <w:rFonts w:ascii="Consolas" w:hAnsi="Consolas"/>
+          <w:sz w:val="18"/>
+        </w:rPr>
+        <w:t>import HorizontalBarGraph from '@johnsoryna/mybargraph'</w:t>
+      </w:r>
+    </w:p>
+    <w:p>
+      <w:pPr>
+        <w:spacing w:after="0" w:before="0" w:line="240" w:lineRule="auto"/>
+        <w:ind w:left="283"/>
+        <w:shd w:val="clear" w:color="auto" w:fill="F2F2F2"/>
+      </w:pPr>
+      <w:r>
+        <w:rPr>
+          <w:rFonts w:ascii="Consolas" w:hAnsi="Consolas"/>
+          <w:sz w:val="18"/>
+        </w:rPr>
+        <w:t xml:space="preserve"> </w:t>
+      </w:r>
+    </w:p>
+    <w:p>
+      <w:pPr>
+        <w:spacing w:after="0" w:before="0" w:line="240" w:lineRule="auto"/>
+        <w:ind w:left="283"/>
+        <w:shd w:val="clear" w:color="auto" w:fill="F2F2F2"/>
+      </w:pPr>
+      <w:r>
+        <w:rPr>
+          <w:rFonts w:ascii="Consolas" w:hAnsi="Consolas"/>
+          <w:sz w:val="18"/>
+        </w:rPr>
+        <w:t>&lt;Card title="Card aus dem Partner-Package"&gt;</w:t>
+      </w:r>
+    </w:p>
+    <w:p>
+      <w:pPr>
+        <w:spacing w:after="0" w:before="0" w:line="240" w:lineRule="auto"/>
+        <w:ind w:left="283"/>
+        <w:shd w:val="clear" w:color="auto" w:fill="F2F2F2"/>
+      </w:pPr>
+      <w:r>
+        <w:rPr>
+          <w:rFonts w:ascii="Consolas" w:hAnsi="Consolas"/>
+          <w:sz w:val="18"/>
+        </w:rPr>
+        <w:t xml:space="preserve">  &lt;p&gt;Diese Karte kommt aus @samusn/react-card-package.&lt;/p&gt;</w:t>
+      </w:r>
+    </w:p>
+    <w:p>
+      <w:pPr>
+        <w:spacing w:after="0" w:before="0" w:line="240" w:lineRule="auto"/>
+        <w:ind w:left="283"/>
+        <w:shd w:val="clear" w:color="auto" w:fill="F2F2F2"/>
+      </w:pPr>
+      <w:r>
+        <w:rPr>
+          <w:rFonts w:ascii="Consolas" w:hAnsi="Consolas"/>
+          <w:sz w:val="18"/>
+        </w:rPr>
+        <w:t>&lt;/Card&gt;</w:t>
+      </w:r>
+    </w:p>
+    <w:p>
+      <w:pPr>
+        <w:spacing w:after="0" w:before="0" w:line="240" w:lineRule="auto"/>
+        <w:ind w:left="283"/>
+        <w:shd w:val="clear" w:color="auto" w:fill="F2F2F2"/>
+      </w:pPr>
+      <w:r>
+        <w:rPr>
+          <w:rFonts w:ascii="Consolas" w:hAnsi="Consolas"/>
+          <w:sz w:val="18"/>
+        </w:rPr>
+        <w:t>&lt;Card title="Beide Packages kombiniert"&gt;</w:t>
+      </w:r>
+    </w:p>
+    <w:p>
+      <w:pPr>
+        <w:spacing w:after="0" w:before="0" w:line="240" w:lineRule="auto"/>
+        <w:ind w:left="283"/>
+        <w:shd w:val="clear" w:color="auto" w:fill="F2F2F2"/>
+      </w:pPr>
+      <w:r>
+        <w:rPr>
+          <w:rFonts w:ascii="Consolas" w:hAnsi="Consolas"/>
+          <w:sz w:val="18"/>
+        </w:rPr>
+        <w:t xml:space="preserve">  &lt;HorizontalBarGraph value={75} maxvalue={100} barwidthpx={280} label="Fortschritt" color="#7c3aed" /&gt;</w:t>
+      </w:r>
+    </w:p>
+    <w:p>
+      <w:pPr>
+        <w:spacing w:after="160" w:before="0" w:line="240" w:lineRule="auto"/>
+        <w:ind w:left="283"/>
+        <w:shd w:val="clear" w:color="auto" w:fill="F2F2F2"/>
+      </w:pPr>
+      <w:r>
+        <w:rPr>
+          <w:rFonts w:ascii="Consolas" w:hAnsi="Consolas"/>
+          <w:sz w:val="18"/>
+        </w:rPr>
+        <w:t>&lt;/Card&gt;</w:t>
+      </w:r>
+    </w:p>
+    <w:p>
+      <w:pPr>
+        <w:pStyle w:val="Heading2"/>
+      </w:pPr>
+      <w:r>
+        <w:t>Problem: require ist nicht definiert</w:t>
+      </w:r>
+    </w:p>
+    <w:p>
+      <w:pPr>
+        <w:spacing w:after="120"/>
+      </w:pPr>
+      <w:r>
+        <w:rPr>
+          <w:b w:val="0"/>
+          <w:i w:val="0"/>
+        </w:rPr>
+        <w:t>Nach dem Import blieb die Seite leer. In der Browser-Konsole: "Calling `require` for "react" in an environment that doesn't expose the `require` function". Ursache: In der vite.config.js des Partners steht unter rollupOptions.external nur react und react-dom, nicht react/jsx-runtime. Vite hat deshalb den JSX-Runtime von React mit ins Bundle kopiert, und dieser Code holt sich React per require("react"). Im Browser gibt es kein require. Mein eigenes Package hat react/jsx-runtime als external, darum tritt das Problem dort nicht auf.</w:t>
+      </w:r>
+    </w:p>
+    <w:p>
+      <w:pPr>
+        <w:spacing w:after="120"/>
+      </w:pPr>
+      <w:r>
+        <w:rPr>
+          <w:b w:val="0"/>
+          <w:i w:val="0"/>
+        </w:rPr>
+        <w:t>Die richtige Korrektur gehört ins Package des Partners (external ergänzen, Version 1.0.1 publizieren). Damit der Konsument trotzdem läuft, habe ich ein kleines Vite-Plugin geschrieben, das nur dieser einen Datei ein lokales require gibt, das "react" liefert. Weil vorgebündelte Abhängigkeiten an Plugins vorbeigehen, muss das Package zusätzlich aus optimizeDeps ausgeschlossen werden.</w:t>
+      </w:r>
+    </w:p>
+    <w:p>
+      <w:pPr>
+        <w:spacing w:after="0" w:before="0" w:line="240" w:lineRule="auto"/>
+        <w:ind w:left="283"/>
+        <w:shd w:val="clear" w:color="auto" w:fill="F2F2F2"/>
+      </w:pPr>
+      <w:r>
+        <w:rPr>
+          <w:rFonts w:ascii="Consolas" w:hAnsi="Consolas"/>
+          <w:sz w:val="18"/>
+        </w:rPr>
+        <w:t>// vite.config.js des Konsumenten (gekuerzt)</w:t>
+      </w:r>
+    </w:p>
+    <w:p>
+      <w:pPr>
+        <w:spacing w:after="0" w:before="0" w:line="240" w:lineRule="auto"/>
+        <w:ind w:left="283"/>
+        <w:shd w:val="clear" w:color="auto" w:fill="F2F2F2"/>
+      </w:pPr>
+      <w:r>
+        <w:rPr>
+          <w:rFonts w:ascii="Consolas" w:hAnsi="Consolas"/>
+          <w:sz w:val="18"/>
+        </w:rPr>
+        <w:t>function fixPartnerRequire() {</w:t>
+      </w:r>
+    </w:p>
+    <w:p>
+      <w:pPr>
+        <w:spacing w:after="0" w:before="0" w:line="240" w:lineRule="auto"/>
+        <w:ind w:left="283"/>
+        <w:shd w:val="clear" w:color="auto" w:fill="F2F2F2"/>
+      </w:pPr>
+      <w:r>
+        <w:rPr>
+          <w:rFonts w:ascii="Consolas" w:hAnsi="Consolas"/>
+          <w:sz w:val="18"/>
+        </w:rPr>
+        <w:t xml:space="preserve">  const target = /@samusn[\/]react-card-package[\/]dist[\/]react-card-package\.es\.js$/</w:t>
+      </w:r>
+    </w:p>
+    <w:p>
+      <w:pPr>
+        <w:spacing w:after="0" w:before="0" w:line="240" w:lineRule="auto"/>
+        <w:ind w:left="283"/>
+        <w:shd w:val="clear" w:color="auto" w:fill="F2F2F2"/>
+      </w:pPr>
+      <w:r>
+        <w:rPr>
+          <w:rFonts w:ascii="Consolas" w:hAnsi="Consolas"/>
+          <w:sz w:val="18"/>
+        </w:rPr>
+        <w:t xml:space="preserve">  return {</w:t>
+      </w:r>
+    </w:p>
+    <w:p>
+      <w:pPr>
+        <w:spacing w:after="0" w:before="0" w:line="240" w:lineRule="auto"/>
+        <w:ind w:left="283"/>
+        <w:shd w:val="clear" w:color="auto" w:fill="F2F2F2"/>
+      </w:pPr>
+      <w:r>
+        <w:rPr>
+          <w:rFonts w:ascii="Consolas" w:hAnsi="Consolas"/>
+          <w:sz w:val="18"/>
+        </w:rPr>
+        <w:t xml:space="preserve">    name: 'fix-partner-require', enforce: 'pre',</w:t>
+      </w:r>
+    </w:p>
+    <w:p>
+      <w:pPr>
+        <w:spacing w:after="0" w:before="0" w:line="240" w:lineRule="auto"/>
+        <w:ind w:left="283"/>
+        <w:shd w:val="clear" w:color="auto" w:fill="F2F2F2"/>
+      </w:pPr>
+      <w:r>
+        <w:rPr>
+          <w:rFonts w:ascii="Consolas" w:hAnsi="Consolas"/>
+          <w:sz w:val="18"/>
+        </w:rPr>
+        <w:t xml:space="preserve">    transform(code, id) {</w:t>
+      </w:r>
+    </w:p>
+    <w:p>
+      <w:pPr>
+        <w:spacing w:after="0" w:before="0" w:line="240" w:lineRule="auto"/>
+        <w:ind w:left="283"/>
+        <w:shd w:val="clear" w:color="auto" w:fill="F2F2F2"/>
+      </w:pPr>
+      <w:r>
+        <w:rPr>
+          <w:rFonts w:ascii="Consolas" w:hAnsi="Consolas"/>
+          <w:sz w:val="18"/>
+        </w:rPr>
+        <w:t xml:space="preserve">      if (!target.test(id.split('?')[0])) return</w:t>
+      </w:r>
+    </w:p>
+    <w:p>
+      <w:pPr>
+        <w:spacing w:after="0" w:before="0" w:line="240" w:lineRule="auto"/>
+        <w:ind w:left="283"/>
+        <w:shd w:val="clear" w:color="auto" w:fill="F2F2F2"/>
+      </w:pPr>
+      <w:r>
+        <w:rPr>
+          <w:rFonts w:ascii="Consolas" w:hAnsi="Consolas"/>
+          <w:sz w:val="18"/>
+        </w:rPr>
+        <w:t xml:space="preserve">      return { code: "import * as __react from 'react';</w:t>
+      </w:r>
+    </w:p>
+    <w:p>
+      <w:pPr>
+        <w:spacing w:after="0" w:before="0" w:line="240" w:lineRule="auto"/>
+        <w:ind w:left="283"/>
+        <w:shd w:val="clear" w:color="auto" w:fill="F2F2F2"/>
+      </w:pPr>
+      <w:r>
+        <w:rPr>
+          <w:rFonts w:ascii="Consolas" w:hAnsi="Consolas"/>
+          <w:sz w:val="18"/>
+        </w:rPr>
+        <w:t>" +</w:t>
+      </w:r>
+    </w:p>
+    <w:p>
+      <w:pPr>
+        <w:spacing w:after="0" w:before="0" w:line="240" w:lineRule="auto"/>
+        <w:ind w:left="283"/>
+        <w:shd w:val="clear" w:color="auto" w:fill="F2F2F2"/>
+      </w:pPr>
+      <w:r>
+        <w:rPr>
+          <w:rFonts w:ascii="Consolas" w:hAnsi="Consolas"/>
+          <w:sz w:val="18"/>
+        </w:rPr>
+        <w:t xml:space="preserve">        "const require = (m) =&gt; { if (m === 'react') return __react.default ?? __react; throw new Error(m) };</w:t>
+      </w:r>
+    </w:p>
+    <w:p>
+      <w:pPr>
+        <w:spacing w:after="0" w:before="0" w:line="240" w:lineRule="auto"/>
+        <w:ind w:left="283"/>
+        <w:shd w:val="clear" w:color="auto" w:fill="F2F2F2"/>
+      </w:pPr>
+      <w:r>
+        <w:rPr>
+          <w:rFonts w:ascii="Consolas" w:hAnsi="Consolas"/>
+          <w:sz w:val="18"/>
+        </w:rPr>
+        <w:t>" + code }</w:t>
+      </w:r>
+    </w:p>
+    <w:p>
+      <w:pPr>
+        <w:spacing w:after="0" w:before="0" w:line="240" w:lineRule="auto"/>
+        <w:ind w:left="283"/>
+        <w:shd w:val="clear" w:color="auto" w:fill="F2F2F2"/>
+      </w:pPr>
+      <w:r>
+        <w:rPr>
+          <w:rFonts w:ascii="Consolas" w:hAnsi="Consolas"/>
+          <w:sz w:val="18"/>
+        </w:rPr>
+        <w:t xml:space="preserve">    },</w:t>
+      </w:r>
+    </w:p>
+    <w:p>
+      <w:pPr>
+        <w:spacing w:after="0" w:before="0" w:line="240" w:lineRule="auto"/>
+        <w:ind w:left="283"/>
+        <w:shd w:val="clear" w:color="auto" w:fill="F2F2F2"/>
+      </w:pPr>
+      <w:r>
+        <w:rPr>
+          <w:rFonts w:ascii="Consolas" w:hAnsi="Consolas"/>
+          <w:sz w:val="18"/>
+        </w:rPr>
+        <w:t xml:space="preserve">  }</w:t>
+      </w:r>
+    </w:p>
+    <w:p>
+      <w:pPr>
+        <w:spacing w:after="0" w:before="0" w:line="240" w:lineRule="auto"/>
+        <w:ind w:left="283"/>
+        <w:shd w:val="clear" w:color="auto" w:fill="F2F2F2"/>
+      </w:pPr>
+      <w:r>
+        <w:rPr>
+          <w:rFonts w:ascii="Consolas" w:hAnsi="Consolas"/>
+          <w:sz w:val="18"/>
+        </w:rPr>
+        <w:t>}</w:t>
+      </w:r>
+    </w:p>
+    <w:p>
+      <w:pPr>
+        <w:spacing w:after="0" w:before="0" w:line="240" w:lineRule="auto"/>
+        <w:ind w:left="283"/>
+        <w:shd w:val="clear" w:color="auto" w:fill="F2F2F2"/>
+      </w:pPr>
+      <w:r>
+        <w:rPr>
+          <w:rFonts w:ascii="Consolas" w:hAnsi="Consolas"/>
+          <w:sz w:val="18"/>
+        </w:rPr>
+        <w:t>export default defineConfig({</w:t>
+      </w:r>
+    </w:p>
+    <w:p>
+      <w:pPr>
+        <w:spacing w:after="0" w:before="0" w:line="240" w:lineRule="auto"/>
+        <w:ind w:left="283"/>
+        <w:shd w:val="clear" w:color="auto" w:fill="F2F2F2"/>
+      </w:pPr>
+      <w:r>
+        <w:rPr>
+          <w:rFonts w:ascii="Consolas" w:hAnsi="Consolas"/>
+          <w:sz w:val="18"/>
+        </w:rPr>
+        <w:t xml:space="preserve">  plugins: [fixPartnerRequire(), react()],</w:t>
+      </w:r>
+    </w:p>
+    <w:p>
+      <w:pPr>
+        <w:spacing w:after="0" w:before="0" w:line="240" w:lineRule="auto"/>
+        <w:ind w:left="283"/>
+        <w:shd w:val="clear" w:color="auto" w:fill="F2F2F2"/>
+      </w:pPr>
+      <w:r>
+        <w:rPr>
+          <w:rFonts w:ascii="Consolas" w:hAnsi="Consolas"/>
+          <w:sz w:val="18"/>
+        </w:rPr>
+        <w:t xml:space="preserve">  optimizeDeps: { exclude: ['@samusn/react-card-package'] },</w:t>
+      </w:r>
+    </w:p>
+    <w:p>
+      <w:pPr>
+        <w:spacing w:after="160" w:before="0" w:line="240" w:lineRule="auto"/>
+        <w:ind w:left="283"/>
+        <w:shd w:val="clear" w:color="auto" w:fill="F2F2F2"/>
+      </w:pPr>
+      <w:r>
+        <w:rPr>
+          <w:rFonts w:ascii="Consolas" w:hAnsi="Consolas"/>
+          <w:sz w:val="18"/>
+        </w:rPr>
+        <w:t>})</w:t>
+      </w:r>
+    </w:p>
+    <w:p>
+      <w:pPr>
+        <w:jc w:val="center"/>
+      </w:pPr>
+      <w:r>
+        <w:drawing>
+          <wp:inline xmlns:a="http://schemas.openxmlformats.org/drawingml/2006/main" xmlns:pic="http://schemas.openxmlformats.org/drawingml/2006/picture">
+            <wp:extent cx="5580000" cy="2711709"/>
+            <wp:docPr id="8" name="Picture 8"/>
+            <wp:cNvGraphicFramePr>
+              <a:graphicFrameLocks noChangeAspect="1"/>
+            </wp:cNvGraphicFramePr>
+            <a:graphic>
+              <a:graphicData uri="http://schemas.openxmlformats.org/drawingml/2006/picture">
+                <pic:pic>
+                  <pic:nvPicPr>
+                    <pic:cNvPr id="0" name="partner_browser.jpg"/>
+                    <pic:cNvPicPr/>
+                  </pic:nvPicPr>
+                  <pic:blipFill>
+                    <a:blip r:embed="rId16"/>
+                    <a:stretch>
+                      <a:fillRect/>
+                    </a:stretch>
+                  </pic:blipFill>
+                  <pic:spPr>
+                    <a:xfrm>
+                      <a:off x="0" y="0"/>
+                      <a:ext cx="5580000" cy="2711709"/>
+                    </a:xfrm>
+                    <a:prstGeom prst="rect"/>
+                  </pic:spPr>
+                </pic:pic>
+              </a:graphicData>
+            </a:graphic>
+          </wp:inline>
+        </w:drawing>
       </w:r>
     </w:p>
     <w:p>
@@ -4660,20 +5137,46 @@
           <w:i/>
           <w:sz w:val="18"/>
         </w:rPr>
-        <w:t>Konsument mit eigenem Package und dem Package des Lernpartners</w:t>
+        <w:t>Konsument: zwei Cards aus @samusn/react-card-package, in der zweiten ein HorizontalBarGraph aus @johnsoryna/mybargraph</w:t>
       </w:r>
     </w:p>
     <w:p>
       <w:pPr>
-        <w:spacing w:before="200" w:after="40"/>
         <w:jc w:val="center"/>
       </w:pPr>
       <w:r>
-        <w:rPr>
-          <w:b/>
-          <w:highlight w:val="yellow"/>
-        </w:rPr>
-        <w:t>[Screenshot einfuegen: screenshots/partner_package_json.png]</w:t>
+        <w:drawing>
+          <wp:inline xmlns:a="http://schemas.openxmlformats.org/drawingml/2006/main" xmlns:pic="http://schemas.openxmlformats.org/drawingml/2006/picture">
+            <wp:extent cx="5580000" cy="2711709"/>
+            <wp:docPr id="9" name="Picture 9"/>
+            <wp:cNvGraphicFramePr>
+              <a:graphicFrameLocks noChangeAspect="1"/>
+            </wp:cNvGraphicFramePr>
+            <a:graphic>
+              <a:graphicData uri="http://schemas.openxmlformats.org/drawingml/2006/picture">
+                <pic:pic>
+                  <pic:nvPicPr>
+                    <pic:cNvPr id="0" name="partner_package_json.jpg"/>
+                    <pic:cNvPicPr/>
+                  </pic:nvPicPr>
+                  <pic:blipFill>
+                    <a:blip r:embed="rId17"/>
+                    <a:stretch>
+                      <a:fillRect/>
+                    </a:stretch>
+                  </pic:blipFill>
+                  <pic:spPr>
+                    <a:xfrm>
+                      <a:off x="0" y="0"/>
+                      <a:ext cx="5580000" cy="2711709"/>
+                    </a:xfrm>
+                    <a:prstGeom prst="rect"/>
+                  </pic:spPr>
+                </pic:pic>
+              </a:graphicData>
+            </a:graphic>
+          </wp:inline>
+        </w:drawing>
       </w:r>
     </w:p>
     <w:p>
@@ -4686,7 +5189,7 @@
           <w:i/>
           <w:sz w:val="18"/>
         </w:rPr>
-        <w:t>package.json des Konsumenten mit beiden Abhängigkeiten</w:t>
+        <w:t>package.json des Konsumenten auf GitHub mit beiden Packages als dependencies</w:t>
       </w:r>
     </w:p>
     <w:p>
@@ -4748,188 +5251,26 @@
         <w:spacing w:after="40"/>
       </w:pPr>
       <w:r>
-        <w:t>npmjs.com erzwingt 2FA beim Publizieren. Der Access-Token-Weg mit "Bypass 2FA" aus der Anleitung wird eingeschränkt, für Pipelines ist Trusted Publishing (OIDC) der vorgesehene Ersatz.</w:t>
+        <w:t>Ein Package muss alle React-Einstiegspunkte als external markieren, auch react/jsx-runtime. Fehlt das, landet ein require("react") im Bundle und das Package funktioniert im Browser nicht. Der Konsument kann das nur mit einem Workaround umgehen, die eigentliche Korrektur gehört ins Package.</w:t>
       </w:r>
     </w:p>
     <w:p>
+      <w:pPr>
+        <w:pStyle w:val="ListBullet"/>
+        <w:spacing w:after="40"/>
+      </w:pPr>
       <w:r>
-        <w:br w:type="page"/>
+        <w:t>Bei GitHub Packages sind Repository- und Package-Sichtbarkeit zwei getrennte Einstellungen.</w:t>
       </w:r>
     </w:p>
     <w:p>
       <w:pPr>
-        <w:pStyle w:val="Heading1"/>
+        <w:pStyle w:val="ListBullet"/>
+        <w:spacing w:after="40"/>
       </w:pPr>
       <w:r>
-        <w:t>Anhang: Offene Punkte (vor der PDF-Abgabe entfernen)</w:t>
+        <w:t>npmjs.com erzwingt 2FA beim Publizieren. Der Access-Token-Weg mit "Bypass 2FA" aus der Anleitung wird eingeschränkt, für Pipelines ist Trusted Publishing (OIDC) der vorgesehene Ersatz.</w:t>
       </w:r>
-    </w:p>
-    <w:p>
-      <w:pPr>
-        <w:spacing w:after="120"/>
-      </w:pPr>
-      <w:r>
-        <w:rPr>
-          <w:b w:val="0"/>
-          <w:i w:val="0"/>
-        </w:rPr>
-        <w:t>Sobald das Package des Lernpartners bekannt ist: installieren, in src/PartnerDemo.jsx einbinden, die gelben Platzhalter im Abschnitt Lernpartner ersetzen, diese zwei Screenshots nach doku/screenshots/ legen und python build_doku.py erneut ausführen.</w:t>
-      </w:r>
-    </w:p>
-    <w:tbl>
-      <w:tblPr>
-        <w:tblStyle w:val="TableGrid"/>
-        <w:tblW w:type="auto" w:w="0"/>
-        <w:tblLook w:firstColumn="1" w:firstRow="1" w:lastColumn="0" w:lastRow="0" w:noHBand="0" w:noVBand="1" w:val="04A0"/>
-      </w:tblPr>
-      <w:tblGrid>
-        <w:gridCol w:w="3135"/>
-        <w:gridCol w:w="3135"/>
-        <w:gridCol w:w="3135"/>
-      </w:tblGrid>
-      <w:tr>
-        <w:tc>
-          <w:tcPr>
-            <w:tcW w:type="dxa" w:w="2551"/>
-            <w:shd w:val="clear" w:color="auto" w:fill="D9E2F3"/>
-          </w:tcPr>
-          <w:p>
-            <w:r/>
-            <w:r>
-              <w:rPr>
-                <w:b/>
-                <w:sz w:val="20"/>
-              </w:rPr>
-              <w:t>Datei</w:t>
-            </w:r>
-          </w:p>
-        </w:tc>
-        <w:tc>
-          <w:tcPr>
-            <w:tcW w:type="dxa" w:w="4252"/>
-            <w:shd w:val="clear" w:color="auto" w:fill="D9E2F3"/>
-          </w:tcPr>
-          <w:p>
-            <w:r/>
-            <w:r>
-              <w:rPr>
-                <w:b/>
-                <w:sz w:val="20"/>
-              </w:rPr>
-              <w:t>Inhalt</w:t>
-            </w:r>
-          </w:p>
-        </w:tc>
-        <w:tc>
-          <w:tcPr>
-            <w:tcW w:type="dxa" w:w="2268"/>
-            <w:shd w:val="clear" w:color="auto" w:fill="D9E2F3"/>
-          </w:tcPr>
-          <w:p>
-            <w:r/>
-            <w:r>
-              <w:rPr>
-                <w:b/>
-                <w:sz w:val="20"/>
-              </w:rPr>
-              <w:t>Wo</w:t>
-            </w:r>
-          </w:p>
-        </w:tc>
-      </w:tr>
-      <w:tr>
-        <w:tc>
-          <w:tcPr>
-            <w:tcW w:type="dxa" w:w="2551"/>
-          </w:tcPr>
-          <w:p>
-            <w:r/>
-            <w:r>
-              <w:rPr>
-                <w:sz w:val="20"/>
-              </w:rPr>
-              <w:t>partner_browser.png</w:t>
-            </w:r>
-          </w:p>
-        </w:tc>
-        <w:tc>
-          <w:tcPr>
-            <w:tcW w:type="dxa" w:w="4252"/>
-          </w:tcPr>
-          <w:p>
-            <w:r/>
-            <w:r>
-              <w:rPr>
-                <w:sz w:val="20"/>
-              </w:rPr>
-              <w:t>Browser: Konsument mit Partner-Komponente</w:t>
-            </w:r>
-          </w:p>
-        </w:tc>
-        <w:tc>
-          <w:tcPr>
-            <w:tcW w:type="dxa" w:w="2268"/>
-          </w:tcPr>
-          <w:p>
-            <w:r/>
-            <w:r>
-              <w:rPr>
-                <w:sz w:val="20"/>
-              </w:rPr>
-              <w:t>Lernpartner</w:t>
-            </w:r>
-          </w:p>
-        </w:tc>
-      </w:tr>
-      <w:tr>
-        <w:tc>
-          <w:tcPr>
-            <w:tcW w:type="dxa" w:w="2551"/>
-          </w:tcPr>
-          <w:p>
-            <w:r/>
-            <w:r>
-              <w:rPr>
-                <w:sz w:val="20"/>
-              </w:rPr>
-              <w:t>partner_package_json.png</w:t>
-            </w:r>
-          </w:p>
-        </w:tc>
-        <w:tc>
-          <w:tcPr>
-            <w:tcW w:type="dxa" w:w="4252"/>
-          </w:tcPr>
-          <w:p>
-            <w:r/>
-            <w:r>
-              <w:rPr>
-                <w:sz w:val="20"/>
-              </w:rPr>
-              <w:t>package.json des Konsumenten mit beiden Packages</w:t>
-            </w:r>
-          </w:p>
-        </w:tc>
-        <w:tc>
-          <w:tcPr>
-            <w:tcW w:type="dxa" w:w="2268"/>
-          </w:tcPr>
-          <w:p>
-            <w:r/>
-            <w:r>
-              <w:rPr>
-                <w:sz w:val="20"/>
-              </w:rPr>
-              <w:t>Lernpartner</w:t>
-            </w:r>
-          </w:p>
-        </w:tc>
-      </w:tr>
-    </w:tbl>
-    <w:p>
-      <w:pPr>
-        <w:spacing w:after="40"/>
-      </w:pPr>
     </w:p>
     <w:sectPr>
       <w:pgSz w:w="12240" w:h="15840"/>

</xml_diff>

<commit_message>
Doku: Codeblock vite.config.js korrigiert
Co-Authored-By: Claude Fable 5.1 <noreply@anthropic.com>
Claude-Session: https://claude.ai/code/session_01LrLPuYCXBtmrXtoqs5tDFr
</commit_message>
<xml_diff>
--- a/doku/M324_React_Package_Johnny_Leonhardt.docx
+++ b/doku/M324_React_Package_Johnny_Leonhardt.docx
@@ -4945,7 +4945,7 @@
           <w:rFonts w:ascii="Consolas" w:hAnsi="Consolas"/>
           <w:sz w:val="18"/>
         </w:rPr>
-        <w:t xml:space="preserve">      return { code: "import * as __react from 'react';</w:t>
+        <w:t xml:space="preserve">      return { code: "import * as __react from 'react';\n" +</w:t>
       </w:r>
     </w:p>
     <w:p>
@@ -4959,35 +4959,7 @@
           <w:rFonts w:ascii="Consolas" w:hAnsi="Consolas"/>
           <w:sz w:val="18"/>
         </w:rPr>
-        <w:t>" +</w:t>
-      </w:r>
-    </w:p>
-    <w:p>
-      <w:pPr>
-        <w:spacing w:after="0" w:before="0" w:line="240" w:lineRule="auto"/>
-        <w:ind w:left="283"/>
-        <w:shd w:val="clear" w:color="auto" w:fill="F2F2F2"/>
-      </w:pPr>
-      <w:r>
-        <w:rPr>
-          <w:rFonts w:ascii="Consolas" w:hAnsi="Consolas"/>
-          <w:sz w:val="18"/>
-        </w:rPr>
-        <w:t xml:space="preserve">        "const require = (m) =&gt; { if (m === 'react') return __react.default ?? __react; throw new Error(m) };</w:t>
-      </w:r>
-    </w:p>
-    <w:p>
-      <w:pPr>
-        <w:spacing w:after="0" w:before="0" w:line="240" w:lineRule="auto"/>
-        <w:ind w:left="283"/>
-        <w:shd w:val="clear" w:color="auto" w:fill="F2F2F2"/>
-      </w:pPr>
-      <w:r>
-        <w:rPr>
-          <w:rFonts w:ascii="Consolas" w:hAnsi="Consolas"/>
-          <w:sz w:val="18"/>
-        </w:rPr>
-        <w:t>" + code }</w:t>
+        <w:t xml:space="preserve">        "const require = (m) =&gt; { if (m === 'react') return __react.default ?? __react; throw new Error(m) };\n" + code }</w:t>
       </w:r>
     </w:p>
     <w:p>

</xml_diff>

<commit_message>
Doku final: PDF-Export, Screenshots zugeschnitten, Codebloecke bereinigt
Co-Authored-By: Claude Fable 5.1 <noreply@anthropic.com>
Claude-Session: https://claude.ai/code/session_01LrLPuYCXBtmrXtoqs5tDFr
</commit_message>
<xml_diff>
--- a/doku/M324_React_Package_Johnny_Leonhardt.docx
+++ b/doku/M324_React_Package_Johnny_Leonhardt.docx
@@ -887,7 +887,7 @@
           <w:b w:val="0"/>
           <w:i w:val="0"/>
         </w:rPr>
-        <w:t>Konfiguration für GitHub Packages (nicht umgesetzt, nur recherchiert):</w:t>
+        <w:t>Konfiguration für GitHub Packages (für das eigene Package nicht umgesetzt; der Lese-Teil kam beim Package des Lernpartners zum Einsatz, siehe unten):</w:t>
       </w:r>
     </w:p>
     <w:p>
@@ -1550,7 +1550,7 @@
           <w:rFonts w:ascii="Consolas" w:hAnsi="Consolas"/>
           <w:sz w:val="18"/>
         </w:rPr>
-        <w:t xml:space="preserve">    vite.demo.config.js        nur fuer die lokale Demo</w:t>
+        <w:t xml:space="preserve">    vite.demo.config.js        nur für die lokale Demo</w:t>
       </w:r>
     </w:p>
     <w:p>
@@ -2404,7 +2404,7 @@
           <w:rFonts w:ascii="Consolas" w:hAnsi="Consolas"/>
           <w:sz w:val="18"/>
         </w:rPr>
-        <w:t>// src/components/HorizontalBarGraph.jsx (gekuerzt)</w:t>
+        <w:t>// src/components/HorizontalBarGraph.jsx (gekürzt)</w:t>
       </w:r>
     </w:p>
     <w:p>
@@ -3496,7 +3496,7 @@
       <w:r>
         <w:drawing>
           <wp:inline xmlns:a="http://schemas.openxmlformats.org/drawingml/2006/main" xmlns:pic="http://schemas.openxmlformats.org/drawingml/2006/picture">
-            <wp:extent cx="5580000" cy="2711709"/>
+            <wp:extent cx="3960000" cy="2396842"/>
             <wp:docPr id="3" name="Picture 3"/>
             <wp:cNvGraphicFramePr>
               <a:graphicFrameLocks noChangeAspect="1"/>
@@ -3517,7 +3517,7 @@
                   <pic:spPr>
                     <a:xfrm>
                       <a:off x="0" y="0"/>
-                      <a:ext cx="5580000" cy="2711709"/>
+                      <a:ext cx="3960000" cy="2396842"/>
                     </a:xfrm>
                     <a:prstGeom prst="rect"/>
                   </pic:spPr>
@@ -3751,7 +3751,7 @@
           <w:rFonts w:ascii="Consolas" w:hAnsi="Consolas"/>
           <w:sz w:val="18"/>
         </w:rPr>
-        <w:t>PS C:\CodeÔ\mybargraph&gt; npm login</w:t>
+        <w:t>PS C:\Code\324\mybargraph&gt; npm login</w:t>
       </w:r>
     </w:p>
     <w:p>
@@ -3793,7 +3793,7 @@
           <w:rFonts w:ascii="Consolas" w:hAnsi="Consolas"/>
           <w:sz w:val="18"/>
         </w:rPr>
-        <w:t>PS C:\CodeÔ\mybargraph&gt; npm publish --access public</w:t>
+        <w:t>PS C:\Code\324\mybargraph&gt; npm publish --access public</w:t>
       </w:r>
     </w:p>
     <w:p>
@@ -4111,7 +4111,7 @@
           <w:rFonts w:ascii="Consolas" w:hAnsi="Consolas"/>
           <w:sz w:val="18"/>
         </w:rPr>
-        <w:t>// src/App.jsx (gekuerzt)</w:t>
+        <w:t>// src/App.jsx (gekürzt)</w:t>
       </w:r>
     </w:p>
     <w:p>
@@ -4329,7 +4329,7 @@
       <w:r>
         <w:drawing>
           <wp:inline xmlns:a="http://schemas.openxmlformats.org/drawingml/2006/main" xmlns:pic="http://schemas.openxmlformats.org/drawingml/2006/picture">
-            <wp:extent cx="5580000" cy="3138750"/>
+            <wp:extent cx="5040000" cy="2835000"/>
             <wp:docPr id="6" name="Picture 6"/>
             <wp:cNvGraphicFramePr>
               <a:graphicFrameLocks noChangeAspect="1"/>
@@ -4350,7 +4350,7 @@
                   <pic:spPr>
                     <a:xfrm>
                       <a:off x="0" y="0"/>
-                      <a:ext cx="5580000" cy="3138750"/>
+                      <a:ext cx="5040000" cy="2835000"/>
                     </a:xfrm>
                     <a:prstGeom prst="rect"/>
                   </pic:spPr>
@@ -4381,7 +4381,7 @@
       <w:r>
         <w:drawing>
           <wp:inline xmlns:a="http://schemas.openxmlformats.org/drawingml/2006/main" xmlns:pic="http://schemas.openxmlformats.org/drawingml/2006/picture">
-            <wp:extent cx="5580000" cy="2711709"/>
+            <wp:extent cx="5040000" cy="2449286"/>
             <wp:docPr id="7" name="Picture 7"/>
             <wp:cNvGraphicFramePr>
               <a:graphicFrameLocks noChangeAspect="1"/>
@@ -4402,7 +4402,7 @@
                   <pic:spPr>
                     <a:xfrm>
                       <a:off x="0" y="0"/>
-                      <a:ext cx="5580000" cy="2711709"/>
+                      <a:ext cx="5040000" cy="2449286"/>
                     </a:xfrm>
                     <a:prstGeom prst="rect"/>
                   </pic:spPr>
@@ -4525,7 +4525,7 @@
           <w:rFonts w:ascii="Consolas" w:hAnsi="Consolas"/>
           <w:sz w:val="18"/>
         </w:rPr>
-        <w:t># PowerShell: Token aus der GitHub-CLI uebernehmen, dann installieren</w:t>
+        <w:t># PowerShell: Token aus der GitHub-CLI übernehmen, dann installieren</w:t>
       </w:r>
     </w:p>
     <w:p>
@@ -4675,7 +4675,7 @@
           <w:rFonts w:ascii="Consolas" w:hAnsi="Consolas"/>
           <w:sz w:val="18"/>
         </w:rPr>
-        <w:t>// src/PartnerDemo.jsx (gekuerzt)</w:t>
+        <w:t>// src/PartnerDemo.jsx (gekürzt)</w:t>
       </w:r>
     </w:p>
     <w:p>
@@ -4847,7 +4847,7 @@
           <w:rFonts w:ascii="Consolas" w:hAnsi="Consolas"/>
           <w:sz w:val="18"/>
         </w:rPr>
-        <w:t>// vite.config.js des Konsumenten (gekuerzt)</w:t>
+        <w:t>// vite.config.js des Konsumenten (gekürzt)</w:t>
       </w:r>
     </w:p>
     <w:p>
@@ -5067,7 +5067,7 @@
       <w:r>
         <w:drawing>
           <wp:inline xmlns:a="http://schemas.openxmlformats.org/drawingml/2006/main" xmlns:pic="http://schemas.openxmlformats.org/drawingml/2006/picture">
-            <wp:extent cx="5580000" cy="2711709"/>
+            <wp:extent cx="5580000" cy="2462602"/>
             <wp:docPr id="8" name="Picture 8"/>
             <wp:cNvGraphicFramePr>
               <a:graphicFrameLocks noChangeAspect="1"/>
@@ -5088,7 +5088,7 @@
                   <pic:spPr>
                     <a:xfrm>
                       <a:off x="0" y="0"/>
-                      <a:ext cx="5580000" cy="2711709"/>
+                      <a:ext cx="5580000" cy="2462602"/>
                     </a:xfrm>
                     <a:prstGeom prst="rect"/>
                   </pic:spPr>

</xml_diff>